<commit_message>
lens_program: flag ED.880.624 for verification; regenerate .docx in sync
Mark the JHU SOE elective ED.880.624 (routed for crosswalk partial 3.f) as
to-be-verified against the live JHU e-catalogue at every citation (docs 1,
2, 7, 8) — // VERIFY: flag in docs 1-2, 'unverified'/'number to be verified'
inline elsewhere.

Regenerate the .docx companions from the .md via pandoc so all are in sync:
docs 1, 2, 4 updated and 7, 8 created to match the numbered-doc pattern.
Doc 1 status line updated to reflect the .docx is regenerated (program-owner
approval round-trip still pending).

Co-Authored-By: Claude Opus 4.8 <noreply@anthropic.com>
Claude-Session: https://claude.ai/code/session_01LxjUdQp1h1n5j8DUCK7uom
</commit_message>
<xml_diff>
--- a/lens_program/1_LENS_Five_Competencies.docx
+++ b/lens_program/1_LENS_Five_Competencies.docx
@@ -8,16 +8,46 @@
       </w:pPr>
       <w:r>
         <w:rPr>
-          <w:bCs/>
-          <w:b/>
-        </w:rPr>
-        <w:t xml:space="preserve">STATUS: CURRENT (v2.2, July 2026).</w:t>
-      </w:r>
-      <w:r>
-        <w:t xml:space="preserve"> </w:t>
-      </w:r>
-      <w:r>
-        <w:t xml:space="preserve">v2.2 restores subobjective 3.6, which the v2.1 sweep dropped without a change-log entry; no other content changes. v2.1 adopted by program owner (J. Diamond) and editor (W. Gray-Roncal). Source of record for case anchors, syllabi, capstone rubrics, and recruiting. Supersedes v2.1, v2.0 (proposal in</w:t>
+          <w:b/>
+          <w:bCs/>
+        </w:rPr>
+        <w:t xml:space="preserve">STATUS: CURRENT (v2.5, July 2026).</w:t>
+      </w:r>
+      <w:r>
+        <w:t xml:space="preserve"> </w:t>
+      </w:r>
+      <w:r>
+        <w:t xml:space="preserve">v2.5 names two competencies that previously rested on the program PLO: subobjectives 2.7 (</w:t>
+      </w:r>
+      <w:r>
+        <w:rPr>
+          <w:i/>
+          <w:iCs/>
+        </w:rPr>
+        <w:t xml:space="preserve">accessibility and inclusion</w:t>
+      </w:r>
+      <w:r>
+        <w:t xml:space="preserve">, ICICLE 3.j) and 4.8 (</w:t>
+      </w:r>
+      <w:r>
+        <w:rPr>
+          <w:i/>
+          <w:iCs/>
+        </w:rPr>
+        <w:t xml:space="preserve">assessment before content</w:t>
+      </w:r>
+      <w:r>
+        <w:t xml:space="preserve">, ICICLE 3.k). With the light-touch course additions in doc 2 v2.7 (data standards, total cost of ownership, capability over time), the crosswalk reaches 33 covered / 6 partial / 3 gap; the three remaining gaps are all Team-tier and deliberately out-of-scope. v2.4 added subobjective 4.7 (</w:t>
+      </w:r>
+      <w:r>
+        <w:rPr>
+          <w:i/>
+          <w:iCs/>
+        </w:rPr>
+        <w:t xml:space="preserve">appraise primary research</w:t>
+      </w:r>
+      <w:r>
+        <w:t xml:space="preserve">), closing the last near-covered Individual-tier competency (5.c and 3.c); the Individual (floor) tier is fully covered. See</w:t>
       </w:r>
       <w:r>
         <w:t xml:space="preserve"> </w:t>
@@ -26,6 +56,55 @@
         <w:rPr>
           <w:rStyle w:val="VerbatimChar"/>
         </w:rPr>
+        <w:t xml:space="preserve">7_LENS_ICICLE_Essential_Competencies_Crosswalk.md</w:t>
+      </w:r>
+      <w:r>
+        <w:t xml:space="preserve"> </w:t>
+      </w:r>
+      <w:r>
+        <w:t xml:space="preserve">and the attainment profile</w:t>
+      </w:r>
+      <w:r>
+        <w:t xml:space="preserve"> </w:t>
+      </w:r>
+      <w:r>
+        <w:rPr>
+          <w:rStyle w:val="VerbatimChar"/>
+        </w:rPr>
+        <w:t xml:space="preserve">8_LENS_Attainment_Profile.md</w:t>
+      </w:r>
+      <w:r>
+        <w:t xml:space="preserve">. v2.3 added subobjectives 2.6 and 3.7 (</w:t>
+      </w:r>
+      <w:r>
+        <w:rPr>
+          <w:i/>
+          <w:iCs/>
+        </w:rPr>
+        <w:t xml:space="preserve">enable the people who deliver</w:t>
+      </w:r>
+      <w:r>
+        <w:t xml:space="preserve">), closing competency 5.c. v2.2 restored subobjective 3.6, dropped by the v2.1 sweep without a change-log entry. v2.1 adopted by program owner (J. Diamond) and editor (W. Gray-Roncal); the v2.3/v2.4 additions are editor-directed and await the same program-owner round-trip as the pending</w:t>
+      </w:r>
+      <w:r>
+        <w:t xml:space="preserve"> </w:t>
+      </w:r>
+      <w:r>
+        <w:rPr>
+          <w:rStyle w:val="VerbatimChar"/>
+        </w:rPr>
+        <w:t xml:space="preserve">.docx</w:t>
+      </w:r>
+      <w:r>
+        <w:t xml:space="preserve">. Source of record for case anchors, syllabi, capstone rubrics, and recruiting. Supersedes v2.3, v2.2, v2.1, v2.0 (proposal in</w:t>
+      </w:r>
+      <w:r>
+        <w:t xml:space="preserve"> </w:t>
+      </w:r>
+      <w:r>
+        <w:rPr>
+          <w:rStyle w:val="VerbatimChar"/>
+        </w:rPr>
         <w:t xml:space="preserve">v2_research/01_*</w:t>
       </w:r>
       <w:r>
@@ -36,8 +115,8 @@
       </w:r>
       <w:r>
         <w:rPr>
-          <w:iCs/>
-          <w:i/>
+          <w:i/>
+          <w:iCs/>
         </w:rPr>
         <w:t xml:space="preserve">Change Log</w:t>
       </w:r>
@@ -60,7 +139,7 @@
         <w:t xml:space="preserve"> </w:t>
       </w:r>
       <w:r>
-        <w:t xml:space="preserve">needs a program-owner round-trip from this</w:t>
+        <w:t xml:space="preserve">is regenerated from this</w:t>
       </w:r>
       <w:r>
         <w:t xml:space="preserve"> </w:t>
@@ -72,7 +151,10 @@
         <w:t xml:space="preserve">.md</w:t>
       </w:r>
       <w:r>
-        <w:t xml:space="preserve">.</w:t>
+        <w:t xml:space="preserve"> </w:t>
+      </w:r>
+      <w:r>
+        <w:t xml:space="preserve">(July 2026, v2.5); program-owner approval round-trip of the v2.1–v2.5 changes remains pending.</w:t>
       </w:r>
     </w:p>
     <w:p>
@@ -90,7 +172,7 @@
         <w:t xml:space="preserve">LENS • Learning Engineering for Next-Generation Systems</w:t>
       </w:r>
     </w:p>
-    <w:bookmarkStart w:id="25" w:name="the-five-lens-competencies"/>
+    <w:bookmarkStart w:id="14" w:name="the-five-lens-competencies"/>
     <w:p>
       <w:pPr>
         <w:pStyle w:val="Heading1"/>
@@ -119,8 +201,8 @@
       </w:r>
       <w:r>
         <w:rPr>
-          <w:bCs/>
-          <w:b/>
+          <w:b/>
+          <w:bCs/>
         </w:rPr>
         <w:t xml:space="preserve">LENS Educational Objectives</w:t>
       </w:r>
@@ -131,19 +213,13 @@
         <w:t xml:space="preserve"> </w:t>
       </w:r>
       <w:r>
-        <w:t xml:space="preserve">“</w:t>
-      </w:r>
-      <w:r>
-        <w:t xml:space="preserve">CLO</w:t>
-      </w:r>
-      <w:r>
-        <w:t xml:space="preserve">”</w:t>
+        <w:t xml:space="preserve">“CLO”</w:t>
       </w:r>
       <w:r>
         <w:t xml:space="preserve">; see doc 2 §4 for the PLO → LEO → CLO → MLO hierarchy). Formal names carry program documentation; taglines carry recruiting and the site. Subobjective numbers (1.1, 3.2, …) are stable tags for case studies, course modules, and capstone rubrics. The LEO language in the program documentation remains the language of record.</w:t>
       </w:r>
     </w:p>
-    <w:bookmarkStart w:id="20" w:name="systems-analysis-see-the-whole-system"/>
+    <w:bookmarkStart w:id="9" w:name="systems-analysis-see-the-whole-system"/>
     <w:p>
       <w:pPr>
         <w:pStyle w:val="Heading2"/>
@@ -156,8 +232,8 @@
       </w:r>
       <w:r>
         <w:rPr>
-          <w:iCs/>
-          <w:i/>
+          <w:i/>
+          <w:iCs/>
         </w:rPr>
         <w:t xml:space="preserve">see the whole system</w:t>
       </w:r>
@@ -168,8 +244,8 @@
       </w:pPr>
       <w:r>
         <w:rPr>
-          <w:bCs/>
-          <w:b/>
+          <w:b/>
+          <w:bCs/>
         </w:rPr>
         <w:t xml:space="preserve">Formal domain:</w:t>
       </w:r>
@@ -186,8 +262,8 @@
       </w:pPr>
       <w:r>
         <w:rPr>
-          <w:bCs/>
-          <w:b/>
+          <w:b/>
+          <w:bCs/>
         </w:rPr>
         <w:t xml:space="preserve">Main objective.</w:t>
       </w:r>
@@ -242,8 +318,8 @@
       </w:r>
       <w:r>
         <w:rPr>
-          <w:iCs/>
-          <w:i/>
+          <w:i/>
+          <w:iCs/>
         </w:rPr>
         <w:t xml:space="preserve">[v2]</w:t>
       </w:r>
@@ -252,8 +328,8 @@
       </w:r>
       <w:r>
         <w:rPr>
-          <w:bCs/>
-          <w:b/>
+          <w:b/>
+          <w:bCs/>
         </w:rPr>
         <w:t xml:space="preserve">Governance-objection diagnostic.</w:t>
       </w:r>
@@ -264,8 +340,8 @@
         <w:t xml:space="preserve">Distinguish a governance objection that good design can dissolve from one that correctly signals the system should not deploy.</w:t>
       </w:r>
     </w:p>
-    <w:bookmarkEnd w:id="20"/>
-    <w:bookmarkStart w:id="21" w:name="iterative-development-build-test-refine"/>
+    <w:bookmarkEnd w:id="9"/>
+    <w:bookmarkStart w:id="10" w:name="iterative-development-build-test-refine"/>
     <w:p>
       <w:pPr>
         <w:pStyle w:val="Heading2"/>
@@ -278,8 +354,8 @@
       </w:r>
       <w:r>
         <w:rPr>
-          <w:iCs/>
-          <w:i/>
+          <w:i/>
+          <w:iCs/>
         </w:rPr>
         <w:t xml:space="preserve">build, test, refine</w:t>
       </w:r>
@@ -290,8 +366,8 @@
       </w:pPr>
       <w:r>
         <w:rPr>
-          <w:bCs/>
-          <w:b/>
+          <w:b/>
+          <w:bCs/>
         </w:rPr>
         <w:t xml:space="preserve">Formal domain:</w:t>
       </w:r>
@@ -308,8 +384,8 @@
       </w:pPr>
       <w:r>
         <w:rPr>
-          <w:bCs/>
-          <w:b/>
+          <w:b/>
+          <w:bCs/>
         </w:rPr>
         <w:t xml:space="preserve">Main objective.</w:t>
       </w:r>
@@ -364,8 +440,8 @@
       </w:r>
       <w:r>
         <w:rPr>
-          <w:iCs/>
-          <w:i/>
+          <w:i/>
+          <w:iCs/>
         </w:rPr>
         <w:t xml:space="preserve">[v2]</w:t>
       </w:r>
@@ -374,8 +450,8 @@
       </w:r>
       <w:r>
         <w:rPr>
-          <w:bCs/>
-          <w:b/>
+          <w:b/>
+          <w:bCs/>
         </w:rPr>
         <w:t xml:space="preserve">Narrate and defend the design iteration in first person.</w:t>
       </w:r>
@@ -386,8 +462,76 @@
         <w:t xml:space="preserve">Design competence includes not only producing an outcome but rendering the iteration legible — the case-unpacking practice is the model.</w:t>
       </w:r>
     </w:p>
-    <w:bookmarkEnd w:id="21"/>
-    <w:bookmarkStart w:id="22" w:name="human-system-collaboration-work-together"/>
+    <w:p>
+      <w:pPr>
+        <w:pStyle w:val="BodyText"/>
+      </w:pPr>
+      <w:r>
+        <w:t xml:space="preserve">2.6</w:t>
+      </w:r>
+      <w:r>
+        <w:t xml:space="preserve"> </w:t>
+      </w:r>
+      <w:r>
+        <w:rPr>
+          <w:i/>
+          <w:iCs/>
+        </w:rPr>
+        <w:t xml:space="preserve">[v2.3]</w:t>
+      </w:r>
+      <w:r>
+        <w:t xml:space="preserve"> </w:t>
+      </w:r>
+      <w:r>
+        <w:rPr>
+          <w:b/>
+          <w:bCs/>
+        </w:rPr>
+        <w:t xml:space="preserve">Enable the people who deliver.</w:t>
+      </w:r>
+      <w:r>
+        <w:t xml:space="preserve"> </w:t>
+      </w:r>
+      <w:r>
+        <w:t xml:space="preserve">Design the human support layer — job aids, performance support at the point of need, train-the-trainer provisions — so the intervention can be delivered without the designer present; treat the deliverer as a designed-for user, not a channel.</w:t>
+      </w:r>
+    </w:p>
+    <w:p>
+      <w:pPr>
+        <w:pStyle w:val="BodyText"/>
+      </w:pPr>
+      <w:r>
+        <w:t xml:space="preserve">2.7</w:t>
+      </w:r>
+      <w:r>
+        <w:t xml:space="preserve"> </w:t>
+      </w:r>
+      <w:r>
+        <w:rPr>
+          <w:i/>
+          <w:iCs/>
+        </w:rPr>
+        <w:t xml:space="preserve">[v2.5]</w:t>
+      </w:r>
+      <w:r>
+        <w:t xml:space="preserve"> </w:t>
+      </w:r>
+      <w:r>
+        <w:rPr>
+          <w:b/>
+          <w:bCs/>
+        </w:rPr>
+        <w:t xml:space="preserve">Design for accessibility and inclusion.</w:t>
+      </w:r>
+      <w:r>
+        <w:t xml:space="preserve"> </w:t>
+      </w:r>
+      <w:r>
+        <w:t xml:space="preserve">Design so the intervention is usable by the range of learners it will actually meet, and test for accessibility and inclusion, not only for usability; recognize where a design assumes a learner who will not be there.</w:t>
+      </w:r>
+    </w:p>
+    <w:bookmarkEnd w:id="10"/>
+    <w:bookmarkStart w:id="11" w:name="human-system-collaboration-work-together"/>
     <w:p>
       <w:pPr>
         <w:pStyle w:val="Heading2"/>
@@ -400,8 +544,8 @@
       </w:r>
       <w:r>
         <w:rPr>
-          <w:iCs/>
-          <w:i/>
+          <w:i/>
+          <w:iCs/>
         </w:rPr>
         <w:t xml:space="preserve">work together</w:t>
       </w:r>
@@ -412,50 +556,36 @@
       </w:pPr>
       <w:r>
         <w:rPr>
-          <w:iCs/>
-          <w:i/>
+          <w:i/>
+          <w:iCs/>
         </w:rPr>
         <w:t xml:space="preserve">[v2.1 — moved from D5 and broadened from</w:t>
       </w:r>
       <w:r>
         <w:rPr>
-          <w:iCs/>
-          <w:i/>
-        </w:rPr>
-        <w:t xml:space="preserve"> </w:t>
-      </w:r>
-      <w:r>
-        <w:rPr>
-          <w:iCs/>
-          <w:i/>
-        </w:rPr>
-        <w:t xml:space="preserve">“</w:t>
-      </w:r>
-      <w:r>
-        <w:rPr>
-          <w:iCs/>
-          <w:i/>
-        </w:rPr>
-        <w:t xml:space="preserve">Machine Teaming and Adaptation.</w:t>
-      </w:r>
-      <w:r>
-        <w:rPr>
-          <w:iCs/>
-          <w:i/>
-        </w:rPr>
-        <w:t xml:space="preserve">”</w:t>
-      </w:r>
-      <w:r>
-        <w:rPr>
-          <w:iCs/>
-          <w:i/>
-        </w:rPr>
-        <w:t xml:space="preserve"> </w:t>
-      </w:r>
-      <w:r>
-        <w:rPr>
-          <w:iCs/>
-          <w:i/>
+          <w:i/>
+          <w:iCs/>
+        </w:rPr>
+        <w:t xml:space="preserve"> </w:t>
+      </w:r>
+      <w:r>
+        <w:rPr>
+          <w:i/>
+          <w:iCs/>
+        </w:rPr>
+        <w:t xml:space="preserve">“Machine Teaming and Adaptation.”</w:t>
+      </w:r>
+      <w:r>
+        <w:rPr>
+          <w:i/>
+          <w:iCs/>
+        </w:rPr>
+        <w:t xml:space="preserve"> </w:t>
+      </w:r>
+      <w:r>
+        <w:rPr>
+          <w:i/>
+          <w:iCs/>
         </w:rPr>
         <w:t xml:space="preserve">The competency now covers human-system collaboration generally; human-AI teaming is one sub-pattern within it, not a separate domain.]</w:t>
       </w:r>
@@ -466,8 +596,8 @@
       </w:pPr>
       <w:r>
         <w:rPr>
-          <w:bCs/>
-          <w:b/>
+          <w:b/>
+          <w:bCs/>
         </w:rPr>
         <w:t xml:space="preserve">Formal domain:</w:t>
       </w:r>
@@ -484,8 +614,8 @@
       </w:pPr>
       <w:r>
         <w:rPr>
-          <w:bCs/>
-          <w:b/>
+          <w:b/>
+          <w:bCs/>
         </w:rPr>
         <w:t xml:space="preserve">Main objective.</w:t>
       </w:r>
@@ -524,8 +654,8 @@
       </w:r>
       <w:r>
         <w:rPr>
-          <w:iCs/>
-          <w:i/>
+          <w:i/>
+          <w:iCs/>
         </w:rPr>
         <w:t xml:space="preserve">[v2]</w:t>
       </w:r>
@@ -534,8 +664,8 @@
       </w:r>
       <w:r>
         <w:rPr>
-          <w:bCs/>
-          <w:b/>
+          <w:b/>
+          <w:bCs/>
         </w:rPr>
         <w:t xml:space="preserve">Delegation with revocation.</w:t>
       </w:r>
@@ -558,8 +688,8 @@
       </w:r>
       <w:r>
         <w:rPr>
-          <w:iCs/>
-          <w:i/>
+          <w:i/>
+          <w:iCs/>
         </w:rPr>
         <w:t xml:space="preserve">[v2]</w:t>
       </w:r>
@@ -568,8 +698,8 @@
       </w:r>
       <w:r>
         <w:rPr>
-          <w:bCs/>
-          <w:b/>
+          <w:b/>
+          <w:bCs/>
         </w:rPr>
         <w:t xml:space="preserve">Collaboration measurement.</w:t>
       </w:r>
@@ -600,8 +730,8 @@
       </w:r>
       <w:r>
         <w:rPr>
-          <w:iCs/>
-          <w:i/>
+          <w:i/>
+          <w:iCs/>
         </w:rPr>
         <w:t xml:space="preserve">[v2.2 — restored]</w:t>
       </w:r>
@@ -612,8 +742,42 @@
         <w:t xml:space="preserve">Communicate evidence-based recommendations for when system augmentation improves versus degrades capability outcomes and operator agency.</w:t>
       </w:r>
     </w:p>
-    <w:bookmarkEnd w:id="22"/>
-    <w:bookmarkStart w:id="23" w:name="test-and-evaluation-show-what-works"/>
+    <w:p>
+      <w:pPr>
+        <w:pStyle w:val="BodyText"/>
+      </w:pPr>
+      <w:r>
+        <w:t xml:space="preserve">3.7</w:t>
+      </w:r>
+      <w:r>
+        <w:t xml:space="preserve"> </w:t>
+      </w:r>
+      <w:r>
+        <w:rPr>
+          <w:i/>
+          <w:iCs/>
+        </w:rPr>
+        <w:t xml:space="preserve">[v2.3]</w:t>
+      </w:r>
+      <w:r>
+        <w:t xml:space="preserve"> </w:t>
+      </w:r>
+      <w:r>
+        <w:rPr>
+          <w:b/>
+          <w:bCs/>
+        </w:rPr>
+        <w:t xml:space="preserve">Design for the people who deliver.</w:t>
+      </w:r>
+      <w:r>
+        <w:t xml:space="preserve"> </w:t>
+      </w:r>
+      <w:r>
+        <w:t xml:space="preserve">Treat the instructor, facilitator, or operator who carries the intervention as a role within the human-system collaboration: engineer their authority, support, and point-of-need aids so their capability is built rather than assumed.</w:t>
+      </w:r>
+    </w:p>
+    <w:bookmarkEnd w:id="11"/>
+    <w:bookmarkStart w:id="12" w:name="test-and-evaluation-show-what-works"/>
     <w:p>
       <w:pPr>
         <w:pStyle w:val="Heading2"/>
@@ -626,8 +790,8 @@
       </w:r>
       <w:r>
         <w:rPr>
-          <w:iCs/>
-          <w:i/>
+          <w:i/>
+          <w:iCs/>
         </w:rPr>
         <w:t xml:space="preserve">show what works</w:t>
       </w:r>
@@ -638,71 +802,43 @@
       </w:pPr>
       <w:r>
         <w:rPr>
-          <w:iCs/>
-          <w:i/>
+          <w:i/>
+          <w:iCs/>
         </w:rPr>
         <w:t xml:space="preserve">[v2.1 — was D3 in v1; renumbered to D4. Subobjective 4.2 (</w:t>
       </w:r>
       <w:r>
         <w:rPr>
-          <w:iCs/>
-          <w:i/>
-        </w:rPr>
-        <w:t xml:space="preserve">“</w:t>
-      </w:r>
-      <w:r>
-        <w:rPr>
-          <w:iCs/>
-          <w:i/>
-        </w:rPr>
-        <w:t xml:space="preserve">gap attribution</w:t>
-      </w:r>
-      <w:r>
-        <w:rPr>
-          <w:iCs/>
-          <w:i/>
-        </w:rPr>
-        <w:t xml:space="preserve">”</w:t>
-      </w:r>
-      <w:r>
-        <w:rPr>
-          <w:iCs/>
-          <w:i/>
+          <w:i/>
+          <w:iCs/>
+        </w:rPr>
+        <w:t xml:space="preserve">“gap attribution”</w:t>
+      </w:r>
+      <w:r>
+        <w:rPr>
+          <w:i/>
+          <w:iCs/>
         </w:rPr>
         <w:t xml:space="preserve">) was the existing</w:t>
       </w:r>
       <w:r>
         <w:rPr>
-          <w:iCs/>
-          <w:i/>
-        </w:rPr>
-        <w:t xml:space="preserve"> </w:t>
-      </w:r>
-      <w:r>
-        <w:rPr>
-          <w:iCs/>
-          <w:i/>
-        </w:rPr>
-        <w:t xml:space="preserve">“</w:t>
-      </w:r>
-      <w:r>
-        <w:rPr>
-          <w:iCs/>
-          <w:i/>
-        </w:rPr>
-        <w:t xml:space="preserve">diagnose the gap</w:t>
-      </w:r>
-      <w:r>
-        <w:rPr>
-          <w:iCs/>
-          <w:i/>
-        </w:rPr>
-        <w:t xml:space="preserve">”</w:t>
-      </w:r>
-      <w:r>
-        <w:rPr>
-          <w:iCs/>
-          <w:i/>
+          <w:i/>
+          <w:iCs/>
+        </w:rPr>
+        <w:t xml:space="preserve"> </w:t>
+      </w:r>
+      <w:r>
+        <w:rPr>
+          <w:i/>
+          <w:iCs/>
+        </w:rPr>
+        <w:t xml:space="preserve">“diagnose the gap”</w:t>
+      </w:r>
+      <w:r>
+        <w:rPr>
+          <w:i/>
+          <w:iCs/>
         </w:rPr>
         <w:t xml:space="preserve">; the v2 sweep names it explicitly.]</w:t>
       </w:r>
@@ -713,8 +849,8 @@
       </w:pPr>
       <w:r>
         <w:rPr>
-          <w:bCs/>
-          <w:b/>
+          <w:b/>
+          <w:bCs/>
         </w:rPr>
         <w:t xml:space="preserve">Formal domain:</w:t>
       </w:r>
@@ -731,8 +867,8 @@
       </w:pPr>
       <w:r>
         <w:rPr>
-          <w:bCs/>
-          <w:b/>
+          <w:b/>
+          <w:bCs/>
         </w:rPr>
         <w:t xml:space="preserve">Main objective.</w:t>
       </w:r>
@@ -763,8 +899,8 @@
       </w:r>
       <w:r>
         <w:rPr>
-          <w:bCs/>
-          <w:b/>
+          <w:b/>
+          <w:bCs/>
         </w:rPr>
         <w:t xml:space="preserve">Gap attribution.</w:t>
       </w:r>
@@ -795,8 +931,8 @@
       </w:r>
       <w:r>
         <w:rPr>
-          <w:iCs/>
-          <w:i/>
+          <w:i/>
+          <w:iCs/>
         </w:rPr>
         <w:t xml:space="preserve">[v2]</w:t>
       </w:r>
@@ -805,8 +941,8 @@
       </w:r>
       <w:r>
         <w:rPr>
-          <w:bCs/>
-          <w:b/>
+          <w:b/>
+          <w:bCs/>
         </w:rPr>
         <w:t xml:space="preserve">Judgment under inadequate evidence.</w:t>
       </w:r>
@@ -837,8 +973,8 @@
       </w:r>
       <w:r>
         <w:rPr>
-          <w:iCs/>
-          <w:i/>
+          <w:i/>
+          <w:iCs/>
         </w:rPr>
         <w:t xml:space="preserve">[v2]</w:t>
       </w:r>
@@ -847,8 +983,8 @@
       </w:r>
       <w:r>
         <w:rPr>
-          <w:bCs/>
-          <w:b/>
+          <w:b/>
+          <w:bCs/>
         </w:rPr>
         <w:t xml:space="preserve">Fairness beyond omission.</w:t>
       </w:r>
@@ -859,8 +995,76 @@
         <w:t xml:space="preserve">Demonstrate that omitting a protected attribute does not establish fairness; analyze competing fairness definitions using demographic-stratified outcome evidence.</w:t>
       </w:r>
     </w:p>
-    <w:bookmarkEnd w:id="23"/>
-    <w:bookmarkStart w:id="24" w:name="X76602b8bd0f6773d25210cecfc4681335591402"/>
+    <w:p>
+      <w:pPr>
+        <w:pStyle w:val="BodyText"/>
+      </w:pPr>
+      <w:r>
+        <w:t xml:space="preserve">4.7</w:t>
+      </w:r>
+      <w:r>
+        <w:t xml:space="preserve"> </w:t>
+      </w:r>
+      <w:r>
+        <w:rPr>
+          <w:i/>
+          <w:iCs/>
+        </w:rPr>
+        <w:t xml:space="preserve">[v2.4]</w:t>
+      </w:r>
+      <w:r>
+        <w:t xml:space="preserve"> </w:t>
+      </w:r>
+      <w:r>
+        <w:rPr>
+          <w:b/>
+          <w:bCs/>
+        </w:rPr>
+        <w:t xml:space="preserve">Appraise primary research.</w:t>
+      </w:r>
+      <w:r>
+        <w:t xml:space="preserve"> </w:t>
+      </w:r>
+      <w:r>
+        <w:t xml:space="preserve">Read a primary study, judge the strength of its method and the validity of the claims drawn from it, and communicate what it does and does not support to those who will not read it.</w:t>
+      </w:r>
+    </w:p>
+    <w:p>
+      <w:pPr>
+        <w:pStyle w:val="BodyText"/>
+      </w:pPr>
+      <w:r>
+        <w:t xml:space="preserve">4.8</w:t>
+      </w:r>
+      <w:r>
+        <w:t xml:space="preserve"> </w:t>
+      </w:r>
+      <w:r>
+        <w:rPr>
+          <w:i/>
+          <w:iCs/>
+        </w:rPr>
+        <w:t xml:space="preserve">[v2.5]</w:t>
+      </w:r>
+      <w:r>
+        <w:t xml:space="preserve"> </w:t>
+      </w:r>
+      <w:r>
+        <w:rPr>
+          <w:b/>
+          <w:bCs/>
+        </w:rPr>
+        <w:t xml:space="preserve">Design the assessment before the content.</w:t>
+      </w:r>
+      <w:r>
+        <w:t xml:space="preserve"> </w:t>
+      </w:r>
+      <w:r>
+        <w:t xml:space="preserve">Operationalize the construct into measurable variables and state what the operationalization leaves out; specify what would count as evidence of the intended learning before building what teaches it; select instruments appropriate to the construct and state their limits.</w:t>
+      </w:r>
+    </w:p>
+    <w:bookmarkEnd w:id="12"/>
+    <w:bookmarkStart w:id="13" w:name="X76602b8bd0f6773d25210cecfc4681335591402"/>
     <w:p>
       <w:pPr>
         <w:pStyle w:val="Heading2"/>
@@ -873,8 +1077,8 @@
       </w:r>
       <w:r>
         <w:rPr>
-          <w:iCs/>
-          <w:i/>
+          <w:i/>
+          <w:iCs/>
         </w:rPr>
         <w:t xml:space="preserve">make it work in the real world</w:t>
       </w:r>
@@ -885,8 +1089,8 @@
       </w:pPr>
       <w:r>
         <w:rPr>
-          <w:iCs/>
-          <w:i/>
+          <w:i/>
+          <w:iCs/>
         </w:rPr>
         <w:t xml:space="preserve">[v2.1 — was D4 in v1; renumbered to D5.]</w:t>
       </w:r>
@@ -897,8 +1101,8 @@
       </w:pPr>
       <w:r>
         <w:rPr>
-          <w:bCs/>
-          <w:b/>
+          <w:b/>
+          <w:bCs/>
         </w:rPr>
         <w:t xml:space="preserve">Formal domain:</w:t>
       </w:r>
@@ -915,8 +1119,8 @@
       </w:pPr>
       <w:r>
         <w:rPr>
-          <w:bCs/>
-          <w:b/>
+          <w:b/>
+          <w:bCs/>
         </w:rPr>
         <w:t xml:space="preserve">Main objective.</w:t>
       </w:r>
@@ -979,8 +1183,8 @@
       </w:r>
       <w:r>
         <w:rPr>
-          <w:iCs/>
-          <w:i/>
+          <w:i/>
+          <w:iCs/>
         </w:rPr>
         <w:t xml:space="preserve">[v2]</w:t>
       </w:r>
@@ -989,8 +1193,8 @@
       </w:r>
       <w:r>
         <w:rPr>
-          <w:bCs/>
-          <w:b/>
+          <w:b/>
+          <w:bCs/>
         </w:rPr>
         <w:t xml:space="preserve">Cross-regime / platform-dependency governance.</w:t>
       </w:r>
@@ -1008,9 +1212,9 @@
         </w:pict>
       </w:r>
     </w:p>
-    <w:bookmarkEnd w:id="24"/>
-    <w:bookmarkEnd w:id="25"/>
-    <w:bookmarkStart w:id="26" w:name="crosswalk-to-formal-leos"/>
+    <w:bookmarkEnd w:id="13"/>
+    <w:bookmarkEnd w:id="14"/>
+    <w:bookmarkStart w:id="15" w:name="crosswalk-to-formal-leos"/>
     <w:p>
       <w:pPr>
         <w:pStyle w:val="Heading1"/>
@@ -1023,8 +1227,8 @@
       <w:tblPr>
         <w:tblStyle w:val="Table"/>
         <w:tblW w:type="pct" w:w="5000"/>
+        <w:tblLayout w:type="fixed"/>
         <w:tblLook w:firstRow="1" w:lastRow="0" w:firstColumn="0" w:lastColumn="0" w:noHBand="0" w:noVBand="0" w:val="0020"/>
-        <w:jc w:val="start"/>
       </w:tblPr>
       <w:tblGrid>
         <w:gridCol w:w="1584"/>
@@ -1035,14 +1239,13 @@
       </w:tblGrid>
       <w:tr>
         <w:trPr>
-          <w:tblHeader w:val="true"/>
+          <w:tblHeader w:val="on"/>
         </w:trPr>
         <w:tc>
           <w:tcPr/>
           <w:p>
             <w:pPr>
               <w:pStyle w:val="Compact"/>
-              <w:jc w:val="left"/>
             </w:pPr>
             <w:r>
               <w:t xml:space="preserve">#</w:t>
@@ -1054,7 +1257,6 @@
           <w:p>
             <w:pPr>
               <w:pStyle w:val="Compact"/>
-              <w:jc w:val="left"/>
             </w:pPr>
             <w:r>
               <w:t xml:space="preserve">Competency</w:t>
@@ -1066,7 +1268,6 @@
           <w:p>
             <w:pPr>
               <w:pStyle w:val="Compact"/>
-              <w:jc w:val="left"/>
             </w:pPr>
             <w:r>
               <w:t xml:space="preserve">Tagline</w:t>
@@ -1078,7 +1279,6 @@
           <w:p>
             <w:pPr>
               <w:pStyle w:val="Compact"/>
-              <w:jc w:val="left"/>
             </w:pPr>
             <w:r>
               <w:t xml:space="preserve">LEO</w:t>
@@ -1090,7 +1290,6 @@
           <w:p>
             <w:pPr>
               <w:pStyle w:val="Compact"/>
-              <w:jc w:val="left"/>
             </w:pPr>
             <w:r>
               <w:t xml:space="preserve">Formal domain (program docs)</w:t>
@@ -1104,7 +1303,6 @@
           <w:p>
             <w:pPr>
               <w:pStyle w:val="Compact"/>
-              <w:jc w:val="left"/>
             </w:pPr>
             <w:r>
               <w:t xml:space="preserve">1</w:t>
@@ -1116,7 +1314,6 @@
           <w:p>
             <w:pPr>
               <w:pStyle w:val="Compact"/>
-              <w:jc w:val="left"/>
             </w:pPr>
             <w:r>
               <w:t xml:space="preserve">Systems Analysis</w:t>
@@ -1128,7 +1325,6 @@
           <w:p>
             <w:pPr>
               <w:pStyle w:val="Compact"/>
-              <w:jc w:val="left"/>
             </w:pPr>
             <w:r>
               <w:t xml:space="preserve">see the whole system</w:t>
@@ -1140,7 +1336,6 @@
           <w:p>
             <w:pPr>
               <w:pStyle w:val="Compact"/>
-              <w:jc w:val="left"/>
             </w:pPr>
             <w:r>
               <w:t xml:space="preserve">LEO-1</w:t>
@@ -1152,7 +1347,6 @@
           <w:p>
             <w:pPr>
               <w:pStyle w:val="Compact"/>
-              <w:jc w:val="left"/>
             </w:pPr>
             <w:r>
               <w:t xml:space="preserve">Systems Thinking and Analysis</w:t>
@@ -1166,7 +1360,6 @@
           <w:p>
             <w:pPr>
               <w:pStyle w:val="Compact"/>
-              <w:jc w:val="left"/>
             </w:pPr>
             <w:r>
               <w:t xml:space="preserve">2</w:t>
@@ -1178,7 +1371,6 @@
           <w:p>
             <w:pPr>
               <w:pStyle w:val="Compact"/>
-              <w:jc w:val="left"/>
             </w:pPr>
             <w:r>
               <w:t xml:space="preserve">Iterative Development</w:t>
@@ -1190,7 +1382,6 @@
           <w:p>
             <w:pPr>
               <w:pStyle w:val="Compact"/>
-              <w:jc w:val="left"/>
             </w:pPr>
             <w:r>
               <w:t xml:space="preserve">build, test, refine</w:t>
@@ -1202,7 +1393,6 @@
           <w:p>
             <w:pPr>
               <w:pStyle w:val="Compact"/>
-              <w:jc w:val="left"/>
             </w:pPr>
             <w:r>
               <w:t xml:space="preserve">LEO-2</w:t>
@@ -1214,7 +1404,6 @@
           <w:p>
             <w:pPr>
               <w:pStyle w:val="Compact"/>
-              <w:jc w:val="left"/>
             </w:pPr>
             <w:r>
               <w:t xml:space="preserve">Learning Engineering Design and Implementation</w:t>
@@ -1228,7 +1417,6 @@
           <w:p>
             <w:pPr>
               <w:pStyle w:val="Compact"/>
-              <w:jc w:val="left"/>
             </w:pPr>
             <w:r>
               <w:t xml:space="preserve">3</w:t>
@@ -1240,7 +1428,6 @@
           <w:p>
             <w:pPr>
               <w:pStyle w:val="Compact"/>
-              <w:jc w:val="left"/>
             </w:pPr>
             <w:r>
               <w:t xml:space="preserve">Human-System Collaboration</w:t>
@@ -1252,7 +1439,6 @@
           <w:p>
             <w:pPr>
               <w:pStyle w:val="Compact"/>
-              <w:jc w:val="left"/>
             </w:pPr>
             <w:r>
               <w:t xml:space="preserve">work together</w:t>
@@ -1264,7 +1450,6 @@
           <w:p>
             <w:pPr>
               <w:pStyle w:val="Compact"/>
-              <w:jc w:val="left"/>
             </w:pPr>
             <w:r>
               <w:t xml:space="preserve">LEO-3</w:t>
@@ -1276,7 +1461,6 @@
           <w:p>
             <w:pPr>
               <w:pStyle w:val="Compact"/>
-              <w:jc w:val="left"/>
             </w:pPr>
             <w:r>
               <w:t xml:space="preserve">Human-System Collaboration and Adaptive Systems</w:t>
@@ -1290,7 +1474,6 @@
           <w:p>
             <w:pPr>
               <w:pStyle w:val="Compact"/>
-              <w:jc w:val="left"/>
             </w:pPr>
             <w:r>
               <w:t xml:space="preserve">4</w:t>
@@ -1302,7 +1485,6 @@
           <w:p>
             <w:pPr>
               <w:pStyle w:val="Compact"/>
-              <w:jc w:val="left"/>
             </w:pPr>
             <w:r>
               <w:t xml:space="preserve">Test and Evaluation</w:t>
@@ -1314,7 +1496,6 @@
           <w:p>
             <w:pPr>
               <w:pStyle w:val="Compact"/>
-              <w:jc w:val="left"/>
             </w:pPr>
             <w:r>
               <w:t xml:space="preserve">show what works</w:t>
@@ -1326,7 +1507,6 @@
           <w:p>
             <w:pPr>
               <w:pStyle w:val="Compact"/>
-              <w:jc w:val="left"/>
             </w:pPr>
             <w:r>
               <w:t xml:space="preserve">LEO-4</w:t>
@@ -1338,7 +1518,6 @@
           <w:p>
             <w:pPr>
               <w:pStyle w:val="Compact"/>
-              <w:jc w:val="left"/>
             </w:pPr>
             <w:r>
               <w:t xml:space="preserve">Data, Measurement, and Evaluation</w:t>
@@ -1352,7 +1531,6 @@
           <w:p>
             <w:pPr>
               <w:pStyle w:val="Compact"/>
-              <w:jc w:val="left"/>
             </w:pPr>
             <w:r>
               <w:t xml:space="preserve">5</w:t>
@@ -1364,7 +1542,6 @@
           <w:p>
             <w:pPr>
               <w:pStyle w:val="Compact"/>
-              <w:jc w:val="left"/>
             </w:pPr>
             <w:r>
               <w:t xml:space="preserve">Navigating Sociotechnical Constraints</w:t>
@@ -1376,7 +1553,6 @@
           <w:p>
             <w:pPr>
               <w:pStyle w:val="Compact"/>
-              <w:jc w:val="left"/>
             </w:pPr>
             <w:r>
               <w:t xml:space="preserve">make it work in the real world</w:t>
@@ -1388,7 +1564,6 @@
           <w:p>
             <w:pPr>
               <w:pStyle w:val="Compact"/>
-              <w:jc w:val="left"/>
             </w:pPr>
             <w:r>
               <w:t xml:space="preserve">LEO-5</w:t>
@@ -1400,7 +1575,6 @@
           <w:p>
             <w:pPr>
               <w:pStyle w:val="Compact"/>
-              <w:jc w:val="left"/>
             </w:pPr>
             <w:r>
               <w:t xml:space="preserve">Context and Domain Fluency</w:t>
@@ -1414,19 +1588,53 @@
         <w:pStyle w:val="BodyText"/>
       </w:pPr>
       <w:r>
-        <w:t xml:space="preserve">Each subobjective unbundles an element of the corresponding LEO. Twenty-eight subobjectives: the 21 of v1, the 7 named v2 additions (1.5, 2.5, 3.3, 3.4, 4.4, 4.6, 5.6), and the v2.2 restoration of 3.6. The additions and the explicit renaming of 4.2 (gap attribution) are required elements within the parent LEO. The reframing of</w:t>
-      </w:r>
-      <w:r>
-        <w:t xml:space="preserve"> </w:t>
-      </w:r>
-      <w:r>
-        <w:t xml:space="preserve">“</w:t>
-      </w:r>
-      <w:r>
-        <w:t xml:space="preserve">decision-grade evidence</w:t>
-      </w:r>
-      <w:r>
-        <w:t xml:space="preserve">”</w:t>
+        <w:t xml:space="preserve">Each subobjective unbundles an element of the corresponding LEO. Thirty-three subobjectives: the 21 of v1, the 7 named v2 additions (1.5, 2.5, 3.3, 3.4, 4.4, 4.6, 5.6), the v2.2 restoration of 3.6, the v2.3 additions 2.6 and 3.7 (</w:t>
+      </w:r>
+      <w:r>
+        <w:rPr>
+          <w:i/>
+          <w:iCs/>
+        </w:rPr>
+        <w:t xml:space="preserve">enable the people who deliver</w:t>
+      </w:r>
+      <w:r>
+        <w:t xml:space="preserve">, ICICLE 5.c), the v2.4 addition 4.7 (</w:t>
+      </w:r>
+      <w:r>
+        <w:rPr>
+          <w:i/>
+          <w:iCs/>
+        </w:rPr>
+        <w:t xml:space="preserve">appraise primary research</w:t>
+      </w:r>
+      <w:r>
+        <w:t xml:space="preserve">, ICICLE 3.c), and the v2.5 additions 2.7 (</w:t>
+      </w:r>
+      <w:r>
+        <w:rPr>
+          <w:i/>
+          <w:iCs/>
+        </w:rPr>
+        <w:t xml:space="preserve">accessibility and inclusion</w:t>
+      </w:r>
+      <w:r>
+        <w:t xml:space="preserve">, ICICLE 3.j) and 4.8 (</w:t>
+      </w:r>
+      <w:r>
+        <w:rPr>
+          <w:i/>
+          <w:iCs/>
+        </w:rPr>
+        <w:t xml:space="preserve">assessment before content</w:t>
+      </w:r>
+      <w:r>
+        <w:t xml:space="preserve">, ICICLE 3.k). The additions and the explicit renaming of 4.2 (gap attribution) are required elements within the parent LEO. The reframing of</w:t>
+      </w:r>
+      <w:r>
+        <w:t xml:space="preserve"> </w:t>
+      </w:r>
+      <w:r>
+        <w:t xml:space="preserve">“decision-grade evidence”</w:t>
       </w:r>
       <w:r>
         <w:t xml:space="preserve"> </w:t>
@@ -1435,8 +1643,8 @@
         <w:t xml:space="preserve">as judgment under irreducible uncertainty is carried at 4.3 and 4.4. If any v2 addition creates friction with documentation of record, drop the number and fold the language back; the scheme renumbers cleanly.</w:t>
       </w:r>
     </w:p>
-    <w:bookmarkEnd w:id="26"/>
-    <w:bookmarkStart w:id="27" w:name="using-the-tags"/>
+    <w:bookmarkEnd w:id="15"/>
+    <w:bookmarkStart w:id="16" w:name="using-the-tags"/>
     <w:p>
       <w:pPr>
         <w:pStyle w:val="Heading1"/>
@@ -1459,8 +1667,8 @@
       </w:pPr>
       <w:r>
         <w:rPr>
-          <w:bCs/>
-          <w:b/>
+          <w:b/>
+          <w:bCs/>
         </w:rPr>
         <w:t xml:space="preserve">Case studies.</w:t>
       </w:r>
@@ -1477,8 +1685,8 @@
       </w:pPr>
       <w:r>
         <w:rPr>
-          <w:bCs/>
-          <w:b/>
+          <w:b/>
+          <w:bCs/>
         </w:rPr>
         <w:t xml:space="preserve">Capstone rubrics.</w:t>
       </w:r>
@@ -1495,8 +1703,8 @@
       </w:pPr>
       <w:r>
         <w:rPr>
-          <w:bCs/>
-          <w:b/>
+          <w:b/>
+          <w:bCs/>
         </w:rPr>
         <w:t xml:space="preserve">Recruiting and the site.</w:t>
       </w:r>
@@ -1507,8 +1715,8 @@
         <w:t xml:space="preserve">Taglines and main objectives are the public-facing layer for capabilitymatters.org and program one-pagers; formal names carry course documentation; the LEO table stays in the documentation of record.</w:t>
       </w:r>
     </w:p>
-    <w:bookmarkEnd w:id="27"/>
-    <w:bookmarkStart w:id="28" w:name="the-five-in-one-breath"/>
+    <w:bookmarkEnd w:id="16"/>
+    <w:bookmarkStart w:id="17" w:name="the-five-in-one-breath"/>
     <w:p>
       <w:pPr>
         <w:pStyle w:val="Heading1"/>
@@ -1523,8 +1731,8 @@
       </w:pPr>
       <w:r>
         <w:rPr>
-          <w:iCs/>
-          <w:i/>
+          <w:i/>
+          <w:iCs/>
         </w:rPr>
         <w:t xml:space="preserve">See the whole system. Build, test, refine. Work together. Show what works. Make it work in the real world.</w:t>
       </w:r>
@@ -1536,8 +1744,8 @@
         </w:pict>
       </w:r>
     </w:p>
-    <w:bookmarkEnd w:id="28"/>
-    <w:bookmarkStart w:id="29" w:name="change-log"/>
+    <w:bookmarkEnd w:id="17"/>
+    <w:bookmarkStart w:id="18" w:name="change-log"/>
     <w:p>
       <w:pPr>
         <w:pStyle w:val="Heading1"/>
@@ -1552,8 +1760,8 @@
       </w:pPr>
       <w:r>
         <w:rPr>
-          <w:bCs/>
-          <w:b/>
+          <w:b/>
+          <w:bCs/>
         </w:rPr>
         <w:t xml:space="preserve">Terminology note — July 2026.</w:t>
       </w:r>
@@ -1568,8 +1776,8 @@
       </w:r>
       <w:r>
         <w:rPr>
-          <w:bCs/>
-          <w:b/>
+          <w:b/>
+          <w:bCs/>
         </w:rPr>
         <w:t xml:space="preserve">LEO</w:t>
       </w:r>
@@ -1583,25 +1791,13 @@
         <w:t xml:space="preserve"> </w:t>
       </w:r>
       <w:r>
-        <w:t xml:space="preserve">“</w:t>
-      </w:r>
-      <w:r>
-        <w:t xml:space="preserve">CLO.</w:t>
-      </w:r>
-      <w:r>
-        <w:t xml:space="preserve">”</w:t>
-      </w:r>
-      <w:r>
-        <w:t xml:space="preserve"> </w:t>
-      </w:r>
-      <w:r>
-        <w:t xml:space="preserve">“</w:t>
-      </w:r>
-      <w:r>
-        <w:t xml:space="preserve">CLO</w:t>
-      </w:r>
-      <w:r>
-        <w:t xml:space="preserve">”</w:t>
+        <w:t xml:space="preserve">“CLO.”</w:t>
+      </w:r>
+      <w:r>
+        <w:t xml:space="preserve"> </w:t>
+      </w:r>
+      <w:r>
+        <w:t xml:space="preserve">“CLO”</w:t>
       </w:r>
       <w:r>
         <w:t xml:space="preserve"> </w:t>
@@ -1614,8 +1810,8 @@
       </w:r>
       <w:r>
         <w:rPr>
-          <w:iCs/>
-          <w:i/>
+          <w:i/>
+          <w:iCs/>
         </w:rPr>
         <w:t xml:space="preserve">course</w:t>
       </w:r>
@@ -1629,13 +1825,7 @@
         <w:t xml:space="preserve"> </w:t>
       </w:r>
       <w:r>
-        <w:t xml:space="preserve">“</w:t>
-      </w:r>
-      <w:r>
-        <w:t xml:space="preserve">MLO</w:t>
-      </w:r>
-      <w:r>
-        <w:t xml:space="preserve">”</w:t>
+        <w:t xml:space="preserve">“MLO”</w:t>
       </w:r>
       <w:r>
         <w:t xml:space="preserve"> </w:t>
@@ -1648,8 +1838,8 @@
       </w:r>
       <w:r>
         <w:rPr>
-          <w:iCs/>
-          <w:i/>
+          <w:i/>
+          <w:iCs/>
         </w:rPr>
         <w:t xml:space="preserve">module</w:t>
       </w:r>
@@ -1666,8 +1856,530 @@
       </w:pPr>
       <w:r>
         <w:rPr>
-          <w:bCs/>
-          <w:b/>
+          <w:b/>
+          <w:bCs/>
+        </w:rPr>
+        <w:t xml:space="preserve">v2.5 — July 2026</w:t>
+      </w:r>
+      <w:r>
+        <w:t xml:space="preserve"> </w:t>
+      </w:r>
+      <w:r>
+        <w:rPr>
+          <w:i/>
+          <w:iCs/>
+        </w:rPr>
+        <w:t xml:space="preserve">(current)</w:t>
+      </w:r>
+      <w:r>
+        <w:t xml:space="preserve"> </w:t>
+      </w:r>
+      <w:r>
+        <w:t xml:space="preserve">-</w:t>
+      </w:r>
+      <w:r>
+        <w:t xml:space="preserve"> </w:t>
+      </w:r>
+      <w:r>
+        <w:rPr>
+          <w:b/>
+          <w:bCs/>
+        </w:rPr>
+        <w:t xml:space="preserve">2.7 and 4.8 named.</w:t>
+      </w:r>
+      <w:r>
+        <w:t xml:space="preserve"> </w:t>
+      </w:r>
+      <w:r>
+        <w:t xml:space="preserve">Two competencies the attainment profile had rated practitioner on the strength of the program PLO (PLO-2.4 accessibility; LEN 4 operationalization) are promoted to named LENS subobjectives so the graduate claim rests on a concentration objective, not only a shared program objective:</w:t>
+      </w:r>
+      <w:r>
+        <w:t xml:space="preserve"> </w:t>
+      </w:r>
+      <w:r>
+        <w:rPr>
+          <w:b/>
+          <w:bCs/>
+        </w:rPr>
+        <w:t xml:space="preserve">2.7</w:t>
+      </w:r>
+      <w:r>
+        <w:t xml:space="preserve"> </w:t>
+      </w:r>
+      <w:r>
+        <w:rPr>
+          <w:i/>
+          <w:iCs/>
+        </w:rPr>
+        <w:t xml:space="preserve">design for accessibility and inclusion</w:t>
+      </w:r>
+      <w:r>
+        <w:t xml:space="preserve"> </w:t>
+      </w:r>
+      <w:r>
+        <w:t xml:space="preserve">(LEO-2, taught in LEN 6, grounded in F2, deepened in LEN 7, assessed in LEN 10) and</w:t>
+      </w:r>
+      <w:r>
+        <w:t xml:space="preserve"> </w:t>
+      </w:r>
+      <w:r>
+        <w:rPr>
+          <w:b/>
+          <w:bCs/>
+        </w:rPr>
+        <w:t xml:space="preserve">4.8</w:t>
+      </w:r>
+      <w:r>
+        <w:t xml:space="preserve"> </w:t>
+      </w:r>
+      <w:r>
+        <w:rPr>
+          <w:i/>
+          <w:iCs/>
+        </w:rPr>
+        <w:t xml:space="preserve">design the assessment before the content</w:t>
+      </w:r>
+      <w:r>
+        <w:t xml:space="preserve"> </w:t>
+      </w:r>
+      <w:r>
+        <w:t xml:space="preserve">(LEO-4, LEN 4). Closes ICICLE crosswalk partials 3.j and 3.k to covered. Subobjective count 31 → 33.</w:t>
+      </w:r>
+      <w:r>
+        <w:t xml:space="preserve"> </w:t>
+      </w:r>
+      <w:r>
+        <w:t xml:space="preserve">-</w:t>
+      </w:r>
+      <w:r>
+        <w:t xml:space="preserve"> </w:t>
+      </w:r>
+      <w:r>
+        <w:rPr>
+          <w:b/>
+          <w:bCs/>
+        </w:rPr>
+        <w:t xml:space="preserve">Light-touch course additions</w:t>
+      </w:r>
+      <w:r>
+        <w:t xml:space="preserve"> </w:t>
+      </w:r>
+      <w:r>
+        <w:t xml:space="preserve">(doc 2 v2.7): data standards and interoperability (xAPI, Caliper) and capability-over-time/skill-decay measurement made explicit in LEN 4; total cost of ownership made explicit in the LEN 10 capstone. These close crosswalk partial 4.a and firm up the notes on 5.e and 6.b; no new subobjectives.</w:t>
+      </w:r>
+    </w:p>
+    <w:p>
+      <w:pPr>
+        <w:pStyle w:val="BodyText"/>
+      </w:pPr>
+      <w:r>
+        <w:rPr>
+          <w:b/>
+          <w:bCs/>
+        </w:rPr>
+        <w:t xml:space="preserve">v2.4 — July 2026</w:t>
+      </w:r>
+      <w:r>
+        <w:t xml:space="preserve"> </w:t>
+      </w:r>
+      <w:r>
+        <w:rPr>
+          <w:i/>
+          <w:iCs/>
+        </w:rPr>
+        <w:t xml:space="preserve">(superseded by v2.5)</w:t>
+      </w:r>
+      <w:r>
+        <w:t xml:space="preserve"> </w:t>
+      </w:r>
+      <w:r>
+        <w:t xml:space="preserve">-</w:t>
+      </w:r>
+      <w:r>
+        <w:t xml:space="preserve"> </w:t>
+      </w:r>
+      <w:r>
+        <w:rPr>
+          <w:b/>
+          <w:bCs/>
+        </w:rPr>
+        <w:t xml:space="preserve">4.7 added —</w:t>
+      </w:r>
+      <w:r>
+        <w:rPr>
+          <w:b/>
+          <w:bCs/>
+        </w:rPr>
+        <w:t xml:space="preserve"> </w:t>
+      </w:r>
+      <w:r>
+        <w:rPr>
+          <w:b/>
+          <w:bCs/>
+          <w:i/>
+          <w:iCs/>
+        </w:rPr>
+        <w:t xml:space="preserve">appraise primary research</w:t>
+      </w:r>
+      <w:r>
+        <w:rPr>
+          <w:b/>
+          <w:bCs/>
+        </w:rPr>
+        <w:t xml:space="preserve">.</w:t>
+      </w:r>
+      <w:r>
+        <w:t xml:space="preserve"> </w:t>
+      </w:r>
+      <w:r>
+        <w:t xml:space="preserve">The crosswalk’s partial 3.c (read and judge research) was the last near-covered Individual (floor) competency: LENS did the work (evidence synthesis in LEN 4, evidence appraisal in the casebook) but never named it. Closed as a subobjective under LEO-4, taught and assessed in LEN 4.</w:t>
+      </w:r>
+      <w:r>
+        <w:t xml:space="preserve"> </w:t>
+      </w:r>
+      <w:r>
+        <w:rPr>
+          <w:b/>
+          <w:bCs/>
+        </w:rPr>
+        <w:t xml:space="preserve">With 4.7 the entire Individual tier of the ICICLE</w:t>
+      </w:r>
+      <w:r>
+        <w:rPr>
+          <w:b/>
+          <w:bCs/>
+        </w:rPr>
+        <w:t xml:space="preserve"> </w:t>
+      </w:r>
+      <w:r>
+        <w:rPr>
+          <w:b/>
+          <w:bCs/>
+          <w:i/>
+          <w:iCs/>
+        </w:rPr>
+        <w:t xml:space="preserve">Essential Competencies</w:t>
+      </w:r>
+      <w:r>
+        <w:rPr>
+          <w:b/>
+          <w:bCs/>
+        </w:rPr>
+        <w:t xml:space="preserve"> </w:t>
+      </w:r>
+      <w:r>
+        <w:rPr>
+          <w:b/>
+          <w:bCs/>
+        </w:rPr>
+        <w:t xml:space="preserve">framework is covered.</w:t>
+      </w:r>
+      <w:r>
+        <w:t xml:space="preserve"> </w:t>
+      </w:r>
+      <w:r>
+        <w:t xml:space="preserve">Subobjective count 30 → 31.</w:t>
+      </w:r>
+      <w:r>
+        <w:t xml:space="preserve"> </w:t>
+      </w:r>
+      <w:r>
+        <w:t xml:space="preserve">- Companion mapping</w:t>
+      </w:r>
+      <w:r>
+        <w:t xml:space="preserve"> </w:t>
+      </w:r>
+      <w:r>
+        <w:rPr>
+          <w:rStyle w:val="VerbatimChar"/>
+        </w:rPr>
+        <w:t xml:space="preserve">2_LENS_Objectives_Course_Mapping.md</w:t>
+      </w:r>
+      <w:r>
+        <w:t xml:space="preserve"> </w:t>
+      </w:r>
+      <w:r>
+        <w:t xml:space="preserve">at</w:t>
+      </w:r>
+      <w:r>
+        <w:t xml:space="preserve"> </w:t>
+      </w:r>
+      <w:r>
+        <w:rPr>
+          <w:b/>
+          <w:bCs/>
+        </w:rPr>
+        <w:t xml:space="preserve">v2.6</w:t>
+      </w:r>
+      <w:r>
+        <w:t xml:space="preserve"> </w:t>
+      </w:r>
+      <w:r>
+        <w:t xml:space="preserve">records the LEN 4 home and, per editor decision, holds crosswalk partial</w:t>
+      </w:r>
+      <w:r>
+        <w:t xml:space="preserve"> </w:t>
+      </w:r>
+      <w:r>
+        <w:rPr>
+          <w:b/>
+          <w:bCs/>
+        </w:rPr>
+        <w:t xml:space="preserve">3.f (run a formal study + human-subjects/IRB) at</w:t>
+      </w:r>
+      <w:r>
+        <w:rPr>
+          <w:b/>
+          <w:bCs/>
+        </w:rPr>
+        <w:t xml:space="preserve"> </w:t>
+      </w:r>
+      <w:r>
+        <w:rPr>
+          <w:b/>
+          <w:bCs/>
+          <w:i/>
+          <w:iCs/>
+        </w:rPr>
+        <w:t xml:space="preserve">awareness</w:t>
+      </w:r>
+      <w:r>
+        <w:rPr>
+          <w:b/>
+          <w:bCs/>
+        </w:rPr>
+        <w:t xml:space="preserve"> </w:t>
+      </w:r>
+      <w:r>
+        <w:rPr>
+          <w:b/>
+          <w:bCs/>
+        </w:rPr>
+        <w:t xml:space="preserve">tier</w:t>
+      </w:r>
+      <w:r>
+        <w:t xml:space="preserve">, routing depth to a university elective — JHU SOE</w:t>
+      </w:r>
+      <w:r>
+        <w:t xml:space="preserve"> </w:t>
+      </w:r>
+      <w:r>
+        <w:rPr>
+          <w:rStyle w:val="VerbatimChar"/>
+        </w:rPr>
+        <w:t xml:space="preserve">ED.880.624 Evaluation and Research in Education</w:t>
+      </w:r>
+      <w:r>
+        <w:t xml:space="preserve"> </w:t>
+      </w:r>
+      <w:r>
+        <w:t xml:space="preserve">(catalogue number</w:t>
+      </w:r>
+      <w:r>
+        <w:t xml:space="preserve"> </w:t>
+      </w:r>
+      <w:r>
+        <w:rPr>
+          <w:rStyle w:val="VerbatimChar"/>
+        </w:rPr>
+        <w:t xml:space="preserve">// VERIFY:</w:t>
+      </w:r>
+      <w:r>
+        <w:t xml:space="preserve">) for study design and research critique, and a Bloomberg School human-subjects research-ethics course where a capstone involves human participants — rather than adding it to the required sequence that LEN 4/LEN 6 already replaced two research courses to build.</w:t>
+      </w:r>
+    </w:p>
+    <w:p>
+      <w:pPr>
+        <w:pStyle w:val="BodyText"/>
+      </w:pPr>
+      <w:r>
+        <w:rPr>
+          <w:b/>
+          <w:bCs/>
+        </w:rPr>
+        <w:t xml:space="preserve">v2.3 — July 2026</w:t>
+      </w:r>
+      <w:r>
+        <w:t xml:space="preserve"> </w:t>
+      </w:r>
+      <w:r>
+        <w:rPr>
+          <w:i/>
+          <w:iCs/>
+        </w:rPr>
+        <w:t xml:space="preserve">(superseded by v2.4)</w:t>
+      </w:r>
+      <w:r>
+        <w:t xml:space="preserve"> </w:t>
+      </w:r>
+      <w:r>
+        <w:t xml:space="preserve">-</w:t>
+      </w:r>
+      <w:r>
+        <w:t xml:space="preserve"> </w:t>
+      </w:r>
+      <w:r>
+        <w:rPr>
+          <w:b/>
+          <w:bCs/>
+        </w:rPr>
+        <w:t xml:space="preserve">2.6 and 3.7 added —</w:t>
+      </w:r>
+      <w:r>
+        <w:rPr>
+          <w:b/>
+          <w:bCs/>
+        </w:rPr>
+        <w:t xml:space="preserve"> </w:t>
+      </w:r>
+      <w:r>
+        <w:rPr>
+          <w:b/>
+          <w:bCs/>
+          <w:i/>
+          <w:iCs/>
+        </w:rPr>
+        <w:t xml:space="preserve">enable the people who deliver</w:t>
+      </w:r>
+      <w:r>
+        <w:rPr>
+          <w:b/>
+          <w:bCs/>
+        </w:rPr>
+        <w:t xml:space="preserve">.</w:t>
+      </w:r>
+      <w:r>
+        <w:t xml:space="preserve"> </w:t>
+      </w:r>
+      <w:r>
+        <w:t xml:space="preserve">The ICICLE</w:t>
+      </w:r>
+      <w:r>
+        <w:t xml:space="preserve"> </w:t>
+      </w:r>
+      <w:r>
+        <w:rPr>
+          <w:i/>
+          <w:iCs/>
+        </w:rPr>
+        <w:t xml:space="preserve">Essential Competencies</w:t>
+      </w:r>
+      <w:r>
+        <w:t xml:space="preserve"> </w:t>
+      </w:r>
+      <w:r>
+        <w:t xml:space="preserve">crosswalk (</w:t>
+      </w:r>
+      <w:r>
+        <w:rPr>
+          <w:rStyle w:val="VerbatimChar"/>
+        </w:rPr>
+        <w:t xml:space="preserve">7_LENS_ICICLE_Essential_Competencies_Crosswalk.md</w:t>
+      </w:r>
+      <w:r>
+        <w:t xml:space="preserve">) found 5.c (</w:t>
+      </w:r>
+      <w:r>
+        <w:t xml:space="preserve">“enable the people who deliver”</w:t>
+      </w:r>
+      <w:r>
+        <w:t xml:space="preserve">) to be the single</w:t>
+      </w:r>
+      <w:r>
+        <w:t xml:space="preserve"> </w:t>
+      </w:r>
+      <w:r>
+        <w:rPr>
+          <w:i/>
+          <w:iCs/>
+        </w:rPr>
+        <w:t xml:space="preserve">Individual</w:t>
+      </w:r>
+      <w:r>
+        <w:t xml:space="preserve">-tier competency LENS did not cover — the field framework marks it as a floor competency every learning engineer holds. Closed as a subobjective in two domains at editor direction:</w:t>
+      </w:r>
+      <w:r>
+        <w:t xml:space="preserve"> </w:t>
+      </w:r>
+      <w:r>
+        <w:rPr>
+          <w:b/>
+          <w:bCs/>
+        </w:rPr>
+        <w:t xml:space="preserve">2.6</w:t>
+      </w:r>
+      <w:r>
+        <w:t xml:space="preserve"> </w:t>
+      </w:r>
+      <w:r>
+        <w:t xml:space="preserve">carries the implementation/sustainment facet (design the support layer so delivery does not depend on the designer — job aids, point-of-need performance support, train-the-trainer),</w:t>
+      </w:r>
+      <w:r>
+        <w:t xml:space="preserve"> </w:t>
+      </w:r>
+      <w:r>
+        <w:rPr>
+          <w:b/>
+          <w:bCs/>
+        </w:rPr>
+        <w:t xml:space="preserve">3.7</w:t>
+      </w:r>
+      <w:r>
+        <w:t xml:space="preserve"> </w:t>
+      </w:r>
+      <w:r>
+        <w:t xml:space="preserve">carries the collaboration facet (the deliverer as a designed-for role within the human-system partnership). Taught in LEN 6 (2.6) and LEN 2 (3.7), deepened in LEN 8 (elective), assessed in the LEN 10 capstone; see doc 2 v2.5.</w:t>
+      </w:r>
+      <w:r>
+        <w:t xml:space="preserve"> </w:t>
+      </w:r>
+      <w:r>
+        <w:t xml:space="preserve">- Subobjective count 28 → 30. No other content changes.</w:t>
+      </w:r>
+      <w:r>
+        <w:t xml:space="preserve"> </w:t>
+      </w:r>
+      <w:r>
+        <w:t xml:space="preserve">-</w:t>
+      </w:r>
+      <w:r>
+        <w:t xml:space="preserve"> </w:t>
+      </w:r>
+      <w:r>
+        <w:rPr>
+          <w:b/>
+          <w:bCs/>
+        </w:rPr>
+        <w:t xml:space="preserve">Deliberate scope, recorded not closed:</w:t>
+      </w:r>
+      <w:r>
+        <w:t xml:space="preserve"> </w:t>
+      </w:r>
+      <w:r>
+        <w:t xml:space="preserve">the crosswalk’s remaining gaps (ICICLE 1.i manage the work, 1.j develop other practitioners, 4.c tools/platform engineering, 4.d content/media production) are all</w:t>
+      </w:r>
+      <w:r>
+        <w:t xml:space="preserve"> </w:t>
+      </w:r>
+      <w:r>
+        <w:rPr>
+          <w:i/>
+          <w:iCs/>
+        </w:rPr>
+        <w:t xml:space="preserve">Team</w:t>
+      </w:r>
+      <w:r>
+        <w:t xml:space="preserve">-tier competencies the field framework permits to be distributed; LENS records them as awareness/out-of-scope in the forthcoming attainment profile rather than backfilling them. Project/program management (1.i) is exercised — not taught as a domain — in the LEN 10 capstone (doc 2 v2.5).</w:t>
+      </w:r>
+    </w:p>
+    <w:p>
+      <w:pPr>
+        <w:pStyle w:val="BodyText"/>
+      </w:pPr>
+      <w:r>
+        <w:rPr>
+          <w:b/>
+          <w:bCs/>
         </w:rPr>
         <w:t xml:space="preserve">v2.2 — July 2026</w:t>
       </w:r>
@@ -1676,10 +2388,10 @@
       </w:r>
       <w:r>
         <w:rPr>
-          <w:iCs/>
-          <w:i/>
-        </w:rPr>
-        <w:t xml:space="preserve">(current)</w:t>
+          <w:i/>
+          <w:iCs/>
+        </w:rPr>
+        <w:t xml:space="preserve">(superseded by v2.3)</w:t>
       </w:r>
       <w:r>
         <w:t xml:space="preserve"> </w:t>
@@ -1692,8 +2404,8 @@
       </w:r>
       <w:r>
         <w:rPr>
-          <w:bCs/>
-          <w:b/>
+          <w:b/>
+          <w:bCs/>
         </w:rPr>
         <w:t xml:space="preserve">3.6 restored.</w:t>
       </w:r>
@@ -1702,8 +2414,8 @@
       </w:r>
       <w:r>
         <w:rPr>
-          <w:iCs/>
-          <w:i/>
+          <w:i/>
+          <w:iCs/>
         </w:rPr>
         <w:t xml:space="preserve">Communicate evidence-based recommendations for when system augmentation improves versus degrades capability outcomes and operator agency.</w:t>
       </w:r>
@@ -1718,8 +2430,8 @@
       </w:r>
       <w:r>
         <w:rPr>
-          <w:bCs/>
-          <w:b/>
+          <w:b/>
+          <w:bCs/>
         </w:rPr>
         <w:t xml:space="preserve">Change-log discipline is what stops this recurring: a deletion is a change and needs an entry.</w:t>
       </w:r>
@@ -1730,13 +2442,7 @@
         <w:t xml:space="preserve">- Wording generalized from v1 (</w:t>
       </w:r>
       <w:r>
-        <w:t xml:space="preserve">“</w:t>
-      </w:r>
-      <w:r>
-        <w:t xml:space="preserve">AI augmentation</w:t>
-      </w:r>
-      <w:r>
-        <w:t xml:space="preserve">”</w:t>
+        <w:t xml:space="preserve">“AI augmentation”</w:t>
       </w:r>
       <w:r>
         <w:t xml:space="preserve">) to</w:t>
@@ -1745,13 +2451,7 @@
         <w:t xml:space="preserve"> </w:t>
       </w:r>
       <w:r>
-        <w:t xml:space="preserve">“</w:t>
-      </w:r>
-      <w:r>
-        <w:t xml:space="preserve">system augmentation,</w:t>
-      </w:r>
-      <w:r>
-        <w:t xml:space="preserve">”</w:t>
+        <w:t xml:space="preserve">“system augmentation,”</w:t>
       </w:r>
       <w:r>
         <w:t xml:space="preserve"> </w:t>
@@ -1778,8 +2478,8 @@
       </w:pPr>
       <w:r>
         <w:rPr>
-          <w:bCs/>
-          <w:b/>
+          <w:b/>
+          <w:bCs/>
         </w:rPr>
         <w:t xml:space="preserve">v2.1 — June 2026</w:t>
       </w:r>
@@ -1788,8 +2488,8 @@
       </w:r>
       <w:r>
         <w:rPr>
-          <w:iCs/>
-          <w:i/>
+          <w:i/>
+          <w:iCs/>
         </w:rPr>
         <w:t xml:space="preserve">(superseded by v2.2; content otherwise current)</w:t>
       </w:r>
@@ -1804,8 +2504,8 @@
       </w:r>
       <w:r>
         <w:rPr>
-          <w:bCs/>
-          <w:b/>
+          <w:b/>
+          <w:bCs/>
         </w:rPr>
         <w:t xml:space="preserve">D3 reorder + rename.</w:t>
       </w:r>
@@ -1820,8 +2520,8 @@
       </w:r>
       <w:r>
         <w:rPr>
-          <w:bCs/>
-          <w:b/>
+          <w:b/>
+          <w:bCs/>
         </w:rPr>
         <w:t xml:space="preserve">Human-System Collaboration</w:t>
       </w:r>
@@ -1842,8 +2542,8 @@
       </w:r>
       <w:r>
         <w:rPr>
-          <w:bCs/>
-          <w:b/>
+          <w:b/>
+          <w:bCs/>
         </w:rPr>
         <w:t xml:space="preserve">7 new subobjectives</w:t>
       </w:r>
@@ -1864,8 +2564,8 @@
       </w:r>
       <w:r>
         <w:rPr>
-          <w:bCs/>
-          <w:b/>
+          <w:b/>
+          <w:bCs/>
         </w:rPr>
         <w:t xml:space="preserve">1 renamed subobjective:</w:t>
       </w:r>
@@ -1879,13 +2579,7 @@
         <w:t xml:space="preserve"> </w:t>
       </w:r>
       <w:r>
-        <w:t xml:space="preserve">“</w:t>
-      </w:r>
-      <w:r>
-        <w:t xml:space="preserve">gap attribution</w:t>
-      </w:r>
-      <w:r>
-        <w:t xml:space="preserve">”</w:t>
+        <w:t xml:space="preserve">“gap attribution”</w:t>
       </w:r>
       <w:r>
         <w:t xml:space="preserve"> </w:t>
@@ -1897,13 +2591,7 @@
         <w:t xml:space="preserve"> </w:t>
       </w:r>
       <w:r>
-        <w:t xml:space="preserve">“</w:t>
-      </w:r>
-      <w:r>
-        <w:t xml:space="preserve">diagnose the gap</w:t>
-      </w:r>
-      <w:r>
-        <w:t xml:space="preserve">”</w:t>
+        <w:t xml:space="preserve">“diagnose the gap”</w:t>
       </w:r>
       <w:r>
         <w:t xml:space="preserve">).</w:t>
@@ -1919,8 +2607,8 @@
       </w:r>
       <w:r>
         <w:rPr>
-          <w:bCs/>
-          <w:b/>
+          <w:b/>
+          <w:bCs/>
         </w:rPr>
         <w:t xml:space="preserve">Reframed term:</w:t>
       </w:r>
@@ -1928,13 +2616,7 @@
         <w:t xml:space="preserve"> </w:t>
       </w:r>
       <w:r>
-        <w:t xml:space="preserve">“</w:t>
-      </w:r>
-      <w:r>
-        <w:t xml:space="preserve">decision-grade evidence</w:t>
-      </w:r>
-      <w:r>
-        <w:t xml:space="preserve">”</w:t>
+        <w:t xml:space="preserve">“decision-grade evidence”</w:t>
       </w:r>
       <w:r>
         <w:t xml:space="preserve"> </w:t>
@@ -1953,8 +2635,8 @@
       </w:r>
       <w:r>
         <w:rPr>
-          <w:bCs/>
-          <w:b/>
+          <w:b/>
+          <w:bCs/>
         </w:rPr>
         <w:t xml:space="preserve">New tagline:</w:t>
       </w:r>
@@ -1968,13 +2650,7 @@
         <w:t xml:space="preserve"> </w:t>
       </w:r>
       <w:r>
-        <w:t xml:space="preserve">“</w:t>
-      </w:r>
-      <w:r>
-        <w:t xml:space="preserve">work together</w:t>
-      </w:r>
-      <w:r>
-        <w:t xml:space="preserve">”</w:t>
+        <w:t xml:space="preserve">“work together”</w:t>
       </w:r>
       <w:r>
         <w:t xml:space="preserve"> </w:t>
@@ -1993,8 +2669,8 @@
       </w:r>
       <w:r>
         <w:rPr>
-          <w:bCs/>
-          <w:b/>
+          <w:b/>
+          <w:bCs/>
         </w:rPr>
         <w:t xml:space="preserve">What the casebook anchor codes mean.</w:t>
       </w:r>
@@ -2024,8 +2700,8 @@
       </w:r>
       <w:r>
         <w:rPr>
-          <w:bCs/>
-          <w:b/>
+          <w:b/>
+          <w:bCs/>
         </w:rPr>
         <w:t xml:space="preserve">Human-System Collaboration</w:t>
       </w:r>
@@ -2039,8 +2715,8 @@
       </w:pPr>
       <w:r>
         <w:rPr>
-          <w:bCs/>
-          <w:b/>
+          <w:b/>
+          <w:bCs/>
         </w:rPr>
         <w:t xml:space="preserve">v2.0 — May 2026</w:t>
       </w:r>
@@ -2049,8 +2725,8 @@
       </w:r>
       <w:r>
         <w:rPr>
-          <w:iCs/>
-          <w:i/>
+          <w:i/>
+          <w:iCs/>
         </w:rPr>
         <w:t xml:space="preserve">(superseded by v2.1; never adopted standalone)</w:t>
       </w:r>
@@ -2076,13 +2752,7 @@
         <w:t xml:space="preserve"> </w:t>
       </w:r>
       <w:r>
-        <w:t xml:space="preserve">“</w:t>
-      </w:r>
-      <w:r>
-        <w:t xml:space="preserve">new LEOs</w:t>
-      </w:r>
-      <w:r>
-        <w:t xml:space="preserve">”</w:t>
+        <w:t xml:space="preserve">“new LEOs”</w:t>
       </w:r>
       <w:r>
         <w:t xml:space="preserve"> </w:t>
@@ -2097,8 +2767,8 @@
       </w:pPr>
       <w:r>
         <w:rPr>
-          <w:bCs/>
-          <w:b/>
+          <w:b/>
+          <w:bCs/>
         </w:rPr>
         <w:t xml:space="preserve">v1 — March 2026</w:t>
       </w:r>
@@ -2107,8 +2777,8 @@
       </w:r>
       <w:r>
         <w:rPr>
-          <w:iCs/>
-          <w:i/>
+          <w:i/>
+          <w:iCs/>
         </w:rPr>
         <w:t xml:space="preserve">(initial)</w:t>
       </w:r>
@@ -2131,8 +2801,12 @@
         <w:t xml:space="preserve">.</w:t>
       </w:r>
     </w:p>
-    <w:bookmarkEnd w:id="29"/>
-    <w:sectPr/>
+    <w:bookmarkEnd w:id="18"/>
+    <w:sectPr>
+      <w:footnotePr>
+        <w:numRestart w:val="eachSect"/>
+      </w:footnotePr>
+    </w:sectPr>
   </w:body>
 </w:document>
 </file>
@@ -2163,14 +2837,14 @@
 <file path=word/numbering.xml><?xml version="1.0" encoding="utf-8"?>
 <w:numbering xmlns:w="http://schemas.openxmlformats.org/wordprocessingml/2006/main">
   <w:abstractNum w:abstractNumId="990">
-    <w:nsid w:val="A990"/>
+    <w:nsid w:val="0000A990"/>
     <w:multiLevelType w:val="multilevel"/>
     <w:lvl w:ilvl="0">
       <w:numFmt w:val="bullet"/>
       <w:lvlText w:val=" "/>
       <w:lvlJc w:val="left"/>
       <w:pPr>
-        <w:ind w:left="720" w:hanging="480"/>
+        <w:ind w:left="720" w:hanging="360"/>
       </w:pPr>
     </w:lvl>
     <w:lvl w:ilvl="1">
@@ -2178,7 +2852,7 @@
       <w:lvlText w:val=" "/>
       <w:lvlJc w:val="left"/>
       <w:pPr>
-        <w:ind w:left="1440" w:hanging="480"/>
+        <w:ind w:left="1440" w:hanging="360"/>
       </w:pPr>
     </w:lvl>
     <w:lvl w:ilvl="2">
@@ -2186,7 +2860,7 @@
       <w:lvlText w:val=" "/>
       <w:lvlJc w:val="left"/>
       <w:pPr>
-        <w:ind w:left="2160" w:hanging="480"/>
+        <w:ind w:left="2160" w:hanging="360"/>
       </w:pPr>
     </w:lvl>
     <w:lvl w:ilvl="3">
@@ -2194,7 +2868,7 @@
       <w:lvlText w:val=" "/>
       <w:lvlJc w:val="left"/>
       <w:pPr>
-        <w:ind w:left="2880" w:hanging="480"/>
+        <w:ind w:left="2880" w:hanging="360"/>
       </w:pPr>
     </w:lvl>
     <w:lvl w:ilvl="4">
@@ -2202,7 +2876,7 @@
       <w:lvlText w:val=" "/>
       <w:lvlJc w:val="left"/>
       <w:pPr>
-        <w:ind w:left="3600" w:hanging="480"/>
+        <w:ind w:left="3600" w:hanging="360"/>
       </w:pPr>
     </w:lvl>
     <w:lvl w:ilvl="5">
@@ -2210,7 +2884,7 @@
       <w:lvlText w:val=" "/>
       <w:lvlJc w:val="left"/>
       <w:pPr>
-        <w:ind w:left="4320" w:hanging="480"/>
+        <w:ind w:left="4320" w:hanging="360"/>
       </w:pPr>
     </w:lvl>
     <w:lvl w:ilvl="6">
@@ -2218,7 +2892,7 @@
       <w:lvlText w:val=" "/>
       <w:lvlJc w:val="left"/>
       <w:pPr>
-        <w:ind w:left="5040" w:hanging="480"/>
+        <w:ind w:left="5040" w:hanging="360"/>
       </w:pPr>
     </w:lvl>
     <w:lvl w:ilvl="7">
@@ -2226,7 +2900,7 @@
       <w:lvlText w:val=" "/>
       <w:lvlJc w:val="left"/>
       <w:pPr>
-        <w:ind w:left="5760" w:hanging="480"/>
+        <w:ind w:left="5760" w:hanging="360"/>
       </w:pPr>
     </w:lvl>
     <w:lvl w:ilvl="8">
@@ -2234,7 +2908,7 @@
       <w:lvlText w:val=" "/>
       <w:lvlJc w:val="left"/>
       <w:pPr>
-        <w:ind w:left="6480" w:hanging="480"/>
+        <w:ind w:left="6480" w:hanging="360"/>
       </w:pPr>
     </w:lvl>
   </w:abstractNum>
@@ -2249,10 +2923,10 @@
   <w:docDefaults>
     <w:rPrDefault>
       <w:rPr>
-        <w:rFonts w:asciiTheme="minorHAnsi" w:cstheme="minorBidi" w:eastAsiaTheme="minorHAnsi" w:hAnsiTheme="minorHAnsi"/>
+        <w:rFonts w:asciiTheme="minorHAnsi" w:cstheme="minorBidi" w:eastAsiaTheme="minorEastAsia" w:hAnsiTheme="minorHAnsi"/>
         <w:sz w:val="24"/>
         <w:szCs w:val="24"/>
-        <w:lang w:bidi="ar-SA" w:eastAsia="en-US" w:val="en-US"/>
+        <w:lang w:bidi="ar-SA" w:eastAsia="zh-CN" w:val="en-US"/>
       </w:rPr>
     </w:rPrDefault>
     <w:pPrDefault>
@@ -2270,10 +2944,10 @@
     <w:name w:val="Body Text"/>
     <w:basedOn w:val="Normal"/>
     <w:link w:val="BodyTextChar"/>
+    <w:qFormat/>
     <w:pPr>
       <w:spacing w:after="180" w:before="180"/>
     </w:pPr>
-    <w:qFormat/>
   </w:style>
   <w:style w:customStyle="1" w:styleId="FirstParagraph" w:type="paragraph">
     <w:name w:val="First Paragraph"/>
@@ -2293,57 +2967,94 @@
     <w:name w:val="Title"/>
     <w:basedOn w:val="Normal"/>
     <w:next w:val="BodyText"/>
+    <w:link w:val="TitleChar"/>
+    <w:uiPriority w:val="10"/>
     <w:qFormat/>
+    <w:rsid w:val="00A10FD9"/>
     <w:pPr>
-      <w:keepNext/>
-      <w:keepLines/>
-      <w:spacing w:after="240" w:before="480"/>
+      <w:spacing w:after="80" w:line="240" w:lineRule="auto"/>
+      <w:contextualSpacing/>
       <w:jc w:val="center"/>
     </w:pPr>
     <w:rPr>
       <w:rFonts w:asciiTheme="majorHAnsi" w:cstheme="majorBidi" w:eastAsiaTheme="majorEastAsia" w:hAnsiTheme="majorHAnsi"/>
-      <w:b/>
-      <w:bCs/>
-      <w:color w:themeColor="accent1" w:themeShade="B5" w:val="345A8A"/>
-      <w:sz w:val="36"/>
-      <w:szCs w:val="36"/>
+      <w:sz w:val="56"/>
+      <w:szCs w:val="56"/>
+    </w:rPr>
+  </w:style>
+  <w:style w:customStyle="1" w:styleId="TitleChar" w:type="character">
+    <w:name w:val="Title Char"/>
+    <w:basedOn w:val="DefaultParagraphFont"/>
+    <w:link w:val="Title"/>
+    <w:uiPriority w:val="10"/>
+    <w:rsid w:val="00A10FD9"/>
+    <w:rPr>
+      <w:rFonts w:asciiTheme="majorHAnsi" w:cstheme="majorBidi" w:eastAsiaTheme="majorEastAsia" w:hAnsiTheme="majorHAnsi"/>
+      <w:sz w:val="56"/>
+      <w:szCs w:val="56"/>
     </w:rPr>
   </w:style>
   <w:style w:styleId="Subtitle" w:type="paragraph">
     <w:name w:val="Subtitle"/>
+    <w:basedOn w:val="Title"/>
+    <w:next w:val="BodyText"/>
+    <w:link w:val="SubtitleChar"/>
+    <w:uiPriority w:val="11"/>
+    <w:qFormat/>
+    <w:rsid w:val="00A10FD9"/>
+    <w:pPr>
+      <w:numPr>
+        <w:ilvl w:val="1"/>
+      </w:numPr>
+    </w:pPr>
+    <w:rPr>
+      <w:rFonts w:cstheme="majorBidi" w:eastAsiaTheme="majorEastAsia"/>
+      <w:spacing w:val="15"/>
+      <w:sz w:val="28"/>
+      <w:szCs w:val="28"/>
+    </w:rPr>
+  </w:style>
+  <w:style w:customStyle="1" w:styleId="SubtitleChar" w:type="character">
+    <w:name w:val="Subtitle Char"/>
+    <w:basedOn w:val="DefaultParagraphFont"/>
+    <w:link w:val="Subtitle"/>
+    <w:uiPriority w:val="11"/>
+    <w:rsid w:val="00A10FD9"/>
+    <w:rPr>
+      <w:rFonts w:cstheme="majorBidi" w:eastAsiaTheme="majorEastAsia"/>
+      <w:color w:themeColor="text1" w:themeTint="A6" w:val="595959"/>
+      <w:spacing w:val="15"/>
+      <w:sz w:val="28"/>
+      <w:szCs w:val="28"/>
+    </w:rPr>
+  </w:style>
+  <w:style w:customStyle="1" w:styleId="Author" w:type="paragraph">
+    <w:name w:val="Author"/>
     <w:basedOn w:val="Title"/>
     <w:next w:val="BodyText"/>
     <w:qFormat/>
     <w:pPr>
       <w:keepNext/>
       <w:keepLines/>
-      <w:spacing w:after="240" w:before="240"/>
-      <w:jc w:val="center"/>
     </w:pPr>
     <w:rPr>
-      <w:sz w:val="30"/>
-      <w:szCs w:val="30"/>
-    </w:rPr>
-  </w:style>
-  <w:style w:customStyle="1" w:styleId="Author" w:type="paragraph">
-    <w:name w:val="Author"/>
+      <w:sz w:val="24"/>
+      <w:szCs w:val="24"/>
+    </w:rPr>
+  </w:style>
+  <w:style w:styleId="Date" w:type="paragraph">
+    <w:name w:val="Date"/>
+    <w:basedOn w:val="Title"/>
     <w:next w:val="BodyText"/>
     <w:qFormat/>
     <w:pPr>
       <w:keepNext/>
       <w:keepLines/>
-      <w:jc w:val="center"/>
     </w:pPr>
-  </w:style>
-  <w:style w:styleId="Date" w:type="paragraph">
-    <w:name w:val="Date"/>
-    <w:next w:val="BodyText"/>
-    <w:qFormat/>
-    <w:pPr>
-      <w:keepNext/>
-      <w:keepLines/>
-      <w:jc w:val="center"/>
-    </w:pPr>
+    <w:rPr>
+      <w:sz w:val="24"/>
+      <w:szCs w:val="24"/>
+    </w:rPr>
   </w:style>
   <w:style w:customStyle="1" w:styleId="AbstractTitle" w:type="paragraph">
     <w:name w:val="Abstract Title"/>
@@ -2353,15 +3064,13 @@
     <w:pPr>
       <w:keepNext/>
       <w:keepLines/>
+      <w:spacing w:after="0" w:before="300"/>
       <w:jc w:val="center"/>
-      <w:spacing w:after="0" w:before="300"/>
     </w:pPr>
     <w:rPr>
+      <w:b/>
       <w:sz w:val="20"/>
       <w:szCs w:val="20"/>
-      <w:b/>
-      <w:color w:val="345A8A"/>
-      &gt;
     </w:rPr>
   </w:style>
   <w:style w:customStyle="1" w:styleId="Abstract" w:type="paragraph">
@@ -2388,191 +3097,321 @@
     <w:rPr/>
   </w:style>
   <w:style w:styleId="Heading1" w:type="paragraph">
-    <w:name w:val="Heading 1"/>
+    <w:name w:val="heading 1"/>
     <w:basedOn w:val="Normal"/>
     <w:next w:val="BodyText"/>
+    <w:link w:val="Heading1Char"/>
     <w:uiPriority w:val="9"/>
     <w:qFormat/>
+    <w:rsid w:val="00A10FD9"/>
     <w:pPr>
       <w:keepNext/>
       <w:keepLines/>
-      <w:spacing w:after="0" w:before="480"/>
+      <w:spacing w:after="80" w:before="360"/>
       <w:outlineLvl w:val="0"/>
     </w:pPr>
     <w:rPr>
       <w:rFonts w:asciiTheme="majorHAnsi" w:cstheme="majorBidi" w:eastAsiaTheme="majorEastAsia" w:hAnsiTheme="majorHAnsi"/>
-      <w:b/>
-      <w:bCs/>
-      <w:color w:themeColor="accent1" w:val="4F81BD"/>
-      <w:sz w:val="32"/>
-      <w:szCs w:val="32"/>
+      <w:color w:themeColor="accent1" w:themeShade="BF" w:val="0F4761"/>
+      <w:sz w:val="40"/>
+      <w:szCs w:val="40"/>
     </w:rPr>
   </w:style>
   <w:style w:styleId="Heading2" w:type="paragraph">
-    <w:name w:val="Heading 2"/>
+    <w:name w:val="heading 2"/>
     <w:basedOn w:val="Normal"/>
     <w:next w:val="BodyText"/>
+    <w:link w:val="Heading2Char"/>
     <w:uiPriority w:val="9"/>
+    <w:semiHidden/>
     <w:unhideWhenUsed/>
     <w:qFormat/>
+    <w:rsid w:val="00A10FD9"/>
     <w:pPr>
       <w:keepNext/>
       <w:keepLines/>
-      <w:spacing w:after="0" w:before="200"/>
+      <w:spacing w:after="80" w:before="160"/>
       <w:outlineLvl w:val="1"/>
     </w:pPr>
     <w:rPr>
       <w:rFonts w:asciiTheme="majorHAnsi" w:cstheme="majorBidi" w:eastAsiaTheme="majorEastAsia" w:hAnsiTheme="majorHAnsi"/>
-      <w:b/>
-      <w:bCs/>
-      <w:color w:themeColor="accent1" w:val="4F81BD"/>
-      <w:sz w:val="28"/>
-      <w:szCs w:val="28"/>
+      <w:color w:themeColor="accent1" w:themeShade="BF" w:val="0F4761"/>
+      <w:sz w:val="32"/>
+      <w:szCs w:val="32"/>
     </w:rPr>
   </w:style>
   <w:style w:styleId="Heading3" w:type="paragraph">
-    <w:name w:val="Heading 3"/>
+    <w:name w:val="heading 3"/>
     <w:basedOn w:val="Normal"/>
     <w:next w:val="BodyText"/>
+    <w:link w:val="Heading3Char"/>
     <w:uiPriority w:val="9"/>
+    <w:semiHidden/>
     <w:unhideWhenUsed/>
     <w:qFormat/>
+    <w:rsid w:val="00A10FD9"/>
     <w:pPr>
       <w:keepNext/>
       <w:keepLines/>
-      <w:spacing w:after="0" w:before="200"/>
+      <w:spacing w:after="80" w:before="160"/>
       <w:outlineLvl w:val="2"/>
     </w:pPr>
     <w:rPr>
-      <w:rFonts w:asciiTheme="majorHAnsi" w:cstheme="majorBidi" w:eastAsiaTheme="majorEastAsia" w:hAnsiTheme="majorHAnsi"/>
-      <w:b/>
-      <w:bCs/>
-      <w:color w:themeColor="accent1" w:val="4F81BD"/>
-      <w:sz w:val="24"/>
-      <w:szCs w:val="24"/>
+      <w:rFonts w:cstheme="majorBidi" w:eastAsiaTheme="majorEastAsia"/>
+      <w:color w:themeColor="accent1" w:themeShade="BF" w:val="0F4761"/>
+      <w:sz w:val="28"/>
+      <w:szCs w:val="28"/>
     </w:rPr>
   </w:style>
   <w:style w:styleId="Heading4" w:type="paragraph">
-    <w:name w:val="Heading 4"/>
+    <w:name w:val="heading 4"/>
     <w:basedOn w:val="Normal"/>
     <w:next w:val="BodyText"/>
+    <w:link w:val="Heading4Char"/>
     <w:uiPriority w:val="9"/>
+    <w:semiHidden/>
     <w:unhideWhenUsed/>
     <w:qFormat/>
+    <w:rsid w:val="00A10FD9"/>
     <w:pPr>
       <w:keepNext/>
       <w:keepLines/>
-      <w:spacing w:after="0" w:before="200"/>
+      <w:spacing w:after="40" w:before="80"/>
       <w:outlineLvl w:val="3"/>
     </w:pPr>
     <w:rPr>
-      <w:rFonts w:asciiTheme="majorHAnsi" w:cstheme="majorBidi" w:eastAsiaTheme="majorEastAsia" w:hAnsiTheme="majorHAnsi"/>
+      <w:rFonts w:cstheme="majorBidi" w:eastAsiaTheme="majorEastAsia"/>
       <w:i/>
-      <w:bCs/>
-      <w:color w:themeColor="accent1" w:val="4F81BD"/>
-      <w:sz w:val="24"/>
-      <w:szCs w:val="24"/>
+      <w:iCs/>
+      <w:color w:themeColor="accent1" w:themeShade="BF" w:val="0F4761"/>
     </w:rPr>
   </w:style>
   <w:style w:styleId="Heading5" w:type="paragraph">
-    <w:name w:val="Heading 5"/>
+    <w:name w:val="heading 5"/>
     <w:basedOn w:val="Normal"/>
     <w:next w:val="BodyText"/>
+    <w:link w:val="Heading5Char"/>
     <w:uiPriority w:val="9"/>
+    <w:semiHidden/>
     <w:unhideWhenUsed/>
     <w:qFormat/>
+    <w:rsid w:val="00A10FD9"/>
     <w:pPr>
       <w:keepNext/>
       <w:keepLines/>
-      <w:spacing w:after="0" w:before="200"/>
+      <w:spacing w:after="40" w:before="80"/>
       <w:outlineLvl w:val="4"/>
     </w:pPr>
     <w:rPr>
-      <w:rFonts w:asciiTheme="majorHAnsi" w:cstheme="majorBidi" w:eastAsiaTheme="majorEastAsia" w:hAnsiTheme="majorHAnsi"/>
-      <w:iCs/>
-      <w:color w:themeColor="accent1" w:val="4F81BD"/>
-      <w:sz w:val="24"/>
-      <w:szCs w:val="24"/>
+      <w:rFonts w:cstheme="majorBidi" w:eastAsiaTheme="majorEastAsia"/>
+      <w:color w:themeColor="accent1" w:themeShade="BF" w:val="0F4761"/>
     </w:rPr>
   </w:style>
   <w:style w:styleId="Heading6" w:type="paragraph">
-    <w:name w:val="Heading 6"/>
+    <w:name w:val="heading 6"/>
     <w:basedOn w:val="Normal"/>
     <w:next w:val="BodyText"/>
+    <w:link w:val="Heading6Char"/>
     <w:uiPriority w:val="9"/>
+    <w:semiHidden/>
     <w:unhideWhenUsed/>
     <w:qFormat/>
+    <w:rsid w:val="00A10FD9"/>
     <w:pPr>
       <w:keepNext/>
       <w:keepLines/>
-      <w:spacing w:after="0" w:before="200"/>
+      <w:spacing w:after="0" w:before="40"/>
       <w:outlineLvl w:val="5"/>
     </w:pPr>
     <w:rPr>
-      <w:rFonts w:asciiTheme="majorHAnsi" w:cstheme="majorBidi" w:eastAsiaTheme="majorEastAsia" w:hAnsiTheme="majorHAnsi"/>
-      <w:color w:themeColor="accent1" w:val="4F81BD"/>
-      <w:sz w:val="24"/>
-      <w:szCs w:val="24"/>
+      <w:rFonts w:cstheme="majorBidi" w:eastAsiaTheme="majorEastAsia"/>
+      <w:i/>
+      <w:iCs/>
+      <w:color w:themeColor="text1" w:themeTint="A6" w:val="595959"/>
     </w:rPr>
   </w:style>
   <w:style w:styleId="Heading7" w:type="paragraph">
-    <w:name w:val="Heading 7"/>
+    <w:name w:val="heading 7"/>
     <w:basedOn w:val="Normal"/>
     <w:next w:val="BodyText"/>
+    <w:link w:val="Heading7Char"/>
     <w:uiPriority w:val="9"/>
+    <w:semiHidden/>
     <w:unhideWhenUsed/>
     <w:qFormat/>
+    <w:rsid w:val="00A10FD9"/>
     <w:pPr>
       <w:keepNext/>
       <w:keepLines/>
-      <w:spacing w:after="0" w:before="200"/>
+      <w:spacing w:after="0" w:before="40"/>
       <w:outlineLvl w:val="6"/>
     </w:pPr>
     <w:rPr>
-      <w:rFonts w:asciiTheme="majorHAnsi" w:cstheme="majorBidi" w:eastAsiaTheme="majorEastAsia" w:hAnsiTheme="majorHAnsi"/>
-      <w:color w:themeColor="accent1" w:val="4F81BD"/>
-      <w:sz w:val="24"/>
-      <w:szCs w:val="24"/>
+      <w:rFonts w:cstheme="majorBidi" w:eastAsiaTheme="majorEastAsia"/>
+      <w:color w:themeColor="text1" w:themeTint="A6" w:val="595959"/>
     </w:rPr>
   </w:style>
   <w:style w:styleId="Heading8" w:type="paragraph">
-    <w:name w:val="Heading 8"/>
+    <w:name w:val="heading 8"/>
     <w:basedOn w:val="Normal"/>
     <w:next w:val="BodyText"/>
+    <w:link w:val="Heading8Char"/>
     <w:uiPriority w:val="9"/>
+    <w:semiHidden/>
     <w:unhideWhenUsed/>
     <w:qFormat/>
+    <w:rsid w:val="00A10FD9"/>
     <w:pPr>
       <w:keepNext/>
       <w:keepLines/>
-      <w:spacing w:after="0" w:before="200"/>
+      <w:spacing w:after="0"/>
       <w:outlineLvl w:val="7"/>
     </w:pPr>
     <w:rPr>
-      <w:rFonts w:asciiTheme="majorHAnsi" w:cstheme="majorBidi" w:eastAsiaTheme="majorEastAsia" w:hAnsiTheme="majorHAnsi"/>
-      <w:color w:themeColor="accent1" w:val="4F81BD"/>
-      <w:sz w:val="24"/>
-      <w:szCs w:val="24"/>
+      <w:rFonts w:cstheme="majorBidi" w:eastAsiaTheme="majorEastAsia"/>
+      <w:i/>
+      <w:iCs/>
+      <w:color w:themeColor="text1" w:themeTint="D8" w:val="272727"/>
     </w:rPr>
   </w:style>
   <w:style w:styleId="Heading9" w:type="paragraph">
-    <w:name w:val="Heading 9"/>
+    <w:name w:val="heading 9"/>
     <w:basedOn w:val="Normal"/>
     <w:next w:val="BodyText"/>
+    <w:link w:val="Heading9Char"/>
     <w:uiPriority w:val="9"/>
+    <w:semiHidden/>
     <w:unhideWhenUsed/>
     <w:qFormat/>
+    <w:rsid w:val="00A10FD9"/>
     <w:pPr>
       <w:keepNext/>
       <w:keepLines/>
-      <w:spacing w:after="0" w:before="200"/>
+      <w:spacing w:after="0"/>
       <w:outlineLvl w:val="8"/>
     </w:pPr>
     <w:rPr>
+      <w:rFonts w:cstheme="majorBidi" w:eastAsiaTheme="majorEastAsia"/>
+      <w:color w:themeColor="text1" w:themeTint="D8" w:val="272727"/>
+    </w:rPr>
+  </w:style>
+  <w:style w:customStyle="1" w:styleId="Heading1Char" w:type="character">
+    <w:name w:val="Heading 1 Char"/>
+    <w:basedOn w:val="DefaultParagraphFont"/>
+    <w:link w:val="Heading1"/>
+    <w:uiPriority w:val="9"/>
+    <w:rsid w:val="00A10FD9"/>
+    <w:rPr>
       <w:rFonts w:asciiTheme="majorHAnsi" w:cstheme="majorBidi" w:eastAsiaTheme="majorEastAsia" w:hAnsiTheme="majorHAnsi"/>
-      <w:color w:themeColor="accent1" w:val="4F81BD"/>
-      <w:sz w:val="24"/>
-      <w:szCs w:val="24"/>
+      <w:color w:themeColor="accent1" w:themeShade="BF" w:val="0F4761"/>
+      <w:sz w:val="40"/>
+      <w:szCs w:val="40"/>
+    </w:rPr>
+  </w:style>
+  <w:style w:customStyle="1" w:styleId="Heading2Char" w:type="character">
+    <w:name w:val="Heading 2 Char"/>
+    <w:basedOn w:val="DefaultParagraphFont"/>
+    <w:link w:val="Heading2"/>
+    <w:uiPriority w:val="9"/>
+    <w:semiHidden/>
+    <w:rsid w:val="00A10FD9"/>
+    <w:rPr>
+      <w:rFonts w:asciiTheme="majorHAnsi" w:cstheme="majorBidi" w:eastAsiaTheme="majorEastAsia" w:hAnsiTheme="majorHAnsi"/>
+      <w:color w:themeColor="accent1" w:themeShade="BF" w:val="0F4761"/>
+      <w:sz w:val="32"/>
+      <w:szCs w:val="32"/>
+    </w:rPr>
+  </w:style>
+  <w:style w:customStyle="1" w:styleId="Heading3Char" w:type="character">
+    <w:name w:val="Heading 3 Char"/>
+    <w:basedOn w:val="DefaultParagraphFont"/>
+    <w:link w:val="Heading3"/>
+    <w:uiPriority w:val="9"/>
+    <w:semiHidden/>
+    <w:rsid w:val="00A10FD9"/>
+    <w:rPr>
+      <w:rFonts w:cstheme="majorBidi" w:eastAsiaTheme="majorEastAsia"/>
+      <w:color w:themeColor="accent1" w:themeShade="BF" w:val="0F4761"/>
+      <w:sz w:val="28"/>
+      <w:szCs w:val="28"/>
+    </w:rPr>
+  </w:style>
+  <w:style w:customStyle="1" w:styleId="Heading4Char" w:type="character">
+    <w:name w:val="Heading 4 Char"/>
+    <w:basedOn w:val="DefaultParagraphFont"/>
+    <w:link w:val="Heading4"/>
+    <w:uiPriority w:val="9"/>
+    <w:semiHidden/>
+    <w:rsid w:val="00A10FD9"/>
+    <w:rPr>
+      <w:rFonts w:cstheme="majorBidi" w:eastAsiaTheme="majorEastAsia"/>
+      <w:i/>
+      <w:iCs/>
+      <w:color w:themeColor="accent1" w:themeShade="BF" w:val="0F4761"/>
+    </w:rPr>
+  </w:style>
+  <w:style w:customStyle="1" w:styleId="Heading5Char" w:type="character">
+    <w:name w:val="Heading 5 Char"/>
+    <w:basedOn w:val="DefaultParagraphFont"/>
+    <w:link w:val="Heading5"/>
+    <w:uiPriority w:val="9"/>
+    <w:semiHidden/>
+    <w:rsid w:val="00A10FD9"/>
+    <w:rPr>
+      <w:rFonts w:cstheme="majorBidi" w:eastAsiaTheme="majorEastAsia"/>
+      <w:color w:themeColor="accent1" w:themeShade="BF" w:val="0F4761"/>
+    </w:rPr>
+  </w:style>
+  <w:style w:customStyle="1" w:styleId="Heading6Char" w:type="character">
+    <w:name w:val="Heading 6 Char"/>
+    <w:basedOn w:val="DefaultParagraphFont"/>
+    <w:link w:val="Heading6"/>
+    <w:uiPriority w:val="9"/>
+    <w:semiHidden/>
+    <w:rsid w:val="00A10FD9"/>
+    <w:rPr>
+      <w:rFonts w:cstheme="majorBidi" w:eastAsiaTheme="majorEastAsia"/>
+      <w:i/>
+      <w:iCs/>
+      <w:color w:themeColor="text1" w:themeTint="A6" w:val="595959"/>
+    </w:rPr>
+  </w:style>
+  <w:style w:customStyle="1" w:styleId="Heading7Char" w:type="character">
+    <w:name w:val="Heading 7 Char"/>
+    <w:basedOn w:val="DefaultParagraphFont"/>
+    <w:link w:val="Heading7"/>
+    <w:uiPriority w:val="9"/>
+    <w:semiHidden/>
+    <w:rsid w:val="00A10FD9"/>
+    <w:rPr>
+      <w:rFonts w:cstheme="majorBidi" w:eastAsiaTheme="majorEastAsia"/>
+      <w:color w:themeColor="text1" w:themeTint="A6" w:val="595959"/>
+    </w:rPr>
+  </w:style>
+  <w:style w:customStyle="1" w:styleId="Heading8Char" w:type="character">
+    <w:name w:val="Heading 8 Char"/>
+    <w:basedOn w:val="DefaultParagraphFont"/>
+    <w:link w:val="Heading8"/>
+    <w:uiPriority w:val="9"/>
+    <w:semiHidden/>
+    <w:rsid w:val="00A10FD9"/>
+    <w:rPr>
+      <w:rFonts w:cstheme="majorBidi" w:eastAsiaTheme="majorEastAsia"/>
+      <w:i/>
+      <w:iCs/>
+      <w:color w:themeColor="text1" w:themeTint="D8" w:val="272727"/>
+    </w:rPr>
+  </w:style>
+  <w:style w:customStyle="1" w:styleId="Heading9Char" w:type="character">
+    <w:name w:val="Heading 9 Char"/>
+    <w:basedOn w:val="DefaultParagraphFont"/>
+    <w:link w:val="Heading9"/>
+    <w:uiPriority w:val="9"/>
+    <w:semiHidden/>
+    <w:rsid w:val="00A10FD9"/>
+    <w:rPr>
+      <w:rFonts w:cstheme="majorBidi" w:eastAsiaTheme="majorEastAsia"/>
+      <w:color w:themeColor="text1" w:themeTint="D8" w:val="272727"/>
     </w:rPr>
   </w:style>
   <w:style w:styleId="BlockText" w:type="paragraph">
@@ -2594,6 +3433,18 @@
     <w:uiPriority w:val="9"/>
     <w:unhideWhenUsed/>
     <w:qFormat/>
+  </w:style>
+  <w:style w:styleId="FootnoteBlockText" w:type="paragraph">
+    <w:name w:val="Footnote Block Text"/>
+    <w:basedOn w:val="FootnoteText"/>
+    <w:next w:val="FootnoteText"/>
+    <w:uiPriority w:val="9"/>
+    <w:unhideWhenUsed/>
+    <w:qFormat/>
+    <w:pPr>
+      <w:spacing w:after="100" w:before="100"/>
+      <w:ind w:firstLine="0" w:left="480" w:right="480"/>
+    </w:pPr>
   </w:style>
   <w:style w:default="1" w:styleId="DefaultParagraphFont" w:type="character">
     <w:name w:val="Default Paragraph Font"/>
@@ -2616,18 +3467,11 @@
       </w:tblCellMar>
     </w:tblPr>
     <w:tblStylePr w:type="firstRow">
-      <w:tblPr>
-        <w:jc w:val="left"/>
-        <w:tblInd w:type="dxa" w:w="0"/>
-      </w:tblPr>
-      <w:trPr>
-        <w:jc w:val="left"/>
-      </w:trPr>
       <w:tcPr>
-        <w:vAlign w:val="bottom"/>
         <w:tcBorders>
           <w:bottom w:val="single"/>
         </w:tcBorders>
+        <w:vAlign w:val="bottom"/>
       </w:tcPr>
     </w:tblStylePr>
   </w:style>
@@ -2742,8 +3586,8 @@
     <w:name w:val="KeywordTok"/>
     <w:basedOn w:val="VerbatimChar"/>
     <w:rPr>
+      <w:b/>
       <w:color w:val="007020"/>
-      <w:b/>
     </w:rPr>
   </w:style>
   <w:style w:type="character" w:customStyle="1" w:styleId="DataTypeTok">
@@ -2820,42 +3664,42 @@
     <w:name w:val="ImportTok"/>
     <w:basedOn w:val="VerbatimChar"/>
     <w:rPr>
+      <w:b/>
       <w:color w:val="008000"/>
-      <w:b/>
     </w:rPr>
   </w:style>
   <w:style w:type="character" w:customStyle="1" w:styleId="CommentTok">
     <w:name w:val="CommentTok"/>
     <w:basedOn w:val="VerbatimChar"/>
     <w:rPr>
+      <w:i/>
       <w:color w:val="60a0b0"/>
-      <w:i/>
     </w:rPr>
   </w:style>
   <w:style w:type="character" w:customStyle="1" w:styleId="DocumentationTok">
     <w:name w:val="DocumentationTok"/>
     <w:basedOn w:val="VerbatimChar"/>
     <w:rPr>
+      <w:i/>
       <w:color w:val="ba2121"/>
-      <w:i/>
     </w:rPr>
   </w:style>
   <w:style w:type="character" w:customStyle="1" w:styleId="AnnotationTok">
     <w:name w:val="AnnotationTok"/>
     <w:basedOn w:val="VerbatimChar"/>
     <w:rPr>
-      <w:color w:val="60a0b0"/>
       <w:b/>
       <w:i/>
+      <w:color w:val="60a0b0"/>
     </w:rPr>
   </w:style>
   <w:style w:type="character" w:customStyle="1" w:styleId="CommentVarTok">
     <w:name w:val="CommentVarTok"/>
     <w:basedOn w:val="VerbatimChar"/>
     <w:rPr>
-      <w:color w:val="60a0b0"/>
       <w:b/>
       <w:i/>
+      <w:color w:val="60a0b0"/>
     </w:rPr>
   </w:style>
   <w:style w:type="character" w:customStyle="1" w:styleId="OtherTok">
@@ -2883,8 +3727,8 @@
     <w:name w:val="ControlFlowTok"/>
     <w:basedOn w:val="VerbatimChar"/>
     <w:rPr>
+      <w:b/>
       <w:color w:val="007020"/>
-      <w:b/>
     </w:rPr>
   </w:style>
   <w:style w:type="character" w:customStyle="1" w:styleId="OperatorTok">
@@ -2929,34 +3773,34 @@
     <w:name w:val="InformationTok"/>
     <w:basedOn w:val="VerbatimChar"/>
     <w:rPr>
-      <w:color w:val="60a0b0"/>
       <w:b/>
       <w:i/>
+      <w:color w:val="60a0b0"/>
     </w:rPr>
   </w:style>
   <w:style w:type="character" w:customStyle="1" w:styleId="WarningTok">
     <w:name w:val="WarningTok"/>
     <w:basedOn w:val="VerbatimChar"/>
     <w:rPr>
-      <w:color w:val="60a0b0"/>
       <w:b/>
       <w:i/>
+      <w:color w:val="60a0b0"/>
     </w:rPr>
   </w:style>
   <w:style w:type="character" w:customStyle="1" w:styleId="AlertTok">
     <w:name w:val="AlertTok"/>
     <w:basedOn w:val="VerbatimChar"/>
     <w:rPr>
+      <w:b/>
       <w:color w:val="ff0000"/>
-      <w:b/>
     </w:rPr>
   </w:style>
   <w:style w:type="character" w:customStyle="1" w:styleId="ErrorTok">
     <w:name w:val="ErrorTok"/>
     <w:basedOn w:val="VerbatimChar"/>
     <w:rPr>
+      <w:b/>
       <w:color w:val="ff0000"/>
-      <w:b/>
     </w:rPr>
   </w:style>
   <w:style w:type="character" w:customStyle="1" w:styleId="NormalTok">
@@ -2978,44 +3822,44 @@
         <a:sysClr val="window" lastClr="FFFFFF"/>
       </a:lt1>
       <a:dk2>
-        <a:srgbClr val="1F497D"/>
+        <a:srgbClr val="0E2841"/>
       </a:dk2>
       <a:lt2>
-        <a:srgbClr val="EEECE1"/>
+        <a:srgbClr val="E8E8E8"/>
       </a:lt2>
       <a:accent1>
-        <a:srgbClr val="4F81BD"/>
+        <a:srgbClr val="156082"/>
       </a:accent1>
       <a:accent2>
-        <a:srgbClr val="C0504D"/>
+        <a:srgbClr val="E97132"/>
       </a:accent2>
       <a:accent3>
-        <a:srgbClr val="9BBB59"/>
+        <a:srgbClr val="196B24"/>
       </a:accent3>
       <a:accent4>
-        <a:srgbClr val="8064A2"/>
+        <a:srgbClr val="0F9ED5"/>
       </a:accent4>
       <a:accent5>
-        <a:srgbClr val="4BACC6"/>
+        <a:srgbClr val="A02B93"/>
       </a:accent5>
       <a:accent6>
-        <a:srgbClr val="F79646"/>
+        <a:srgbClr val="4EA72E"/>
       </a:accent6>
       <a:hlink>
-        <a:srgbClr val="0000FF"/>
+        <a:srgbClr val="467886"/>
       </a:hlink>
       <a:folHlink>
-        <a:srgbClr val="800080"/>
+        <a:srgbClr val="96607D"/>
       </a:folHlink>
     </a:clrScheme>
     <a:fontScheme name="Office">
       <a:majorFont>
-        <a:latin typeface="Calibri"/>
+        <a:latin typeface="Aptos Display" panose="02110004020202020204"/>
         <a:ea typeface=""/>
         <a:cs typeface=""/>
-        <a:font script="Jpan" typeface="ＭＳ ゴシック"/>
+        <a:font script="Jpan" typeface="游ゴシック Light"/>
         <a:font script="Hang" typeface="맑은 고딕"/>
-        <a:font script="Hans" typeface="宋体"/>
+        <a:font script="Hans" typeface="等线 Light"/>
         <a:font script="Hant" typeface="新細明體"/>
         <a:font script="Arab" typeface="Times New Roman"/>
         <a:font script="Hebr" typeface="Times New Roman"/>
@@ -3042,14 +3886,32 @@
         <a:font script="Mong" typeface="Mongolian Baiti"/>
         <a:font script="Viet" typeface="Times New Roman"/>
         <a:font script="Uigh" typeface="Microsoft Uighur"/>
+        <a:font script="Geor" typeface="Sylfaen"/>
+        <a:font script="Armn" typeface="Arial"/>
+        <a:font script="Bugi" typeface="Leelawadee UI"/>
+        <a:font script="Bopo" typeface="Microsoft JhengHei"/>
+        <a:font script="Java" typeface="Javanese Text"/>
+        <a:font script="Lisu" typeface="Segoe UI"/>
+        <a:font script="Mymr" typeface="Myanmar Text"/>
+        <a:font script="Nkoo" typeface="Ebrima"/>
+        <a:font script="Olck" typeface="Nirmala UI"/>
+        <a:font script="Osma" typeface="Ebrima"/>
+        <a:font script="Phag" typeface="Phagspa"/>
+        <a:font script="Syrn" typeface="Estrangelo Edessa"/>
+        <a:font script="Syrj" typeface="Estrangelo Edessa"/>
+        <a:font script="Syre" typeface="Estrangelo Edessa"/>
+        <a:font script="Sora" typeface="Nirmala UI"/>
+        <a:font script="Tale" typeface="Microsoft Tai Le"/>
+        <a:font script="Talu" typeface="Microsoft New Tai Lue"/>
+        <a:font script="Tfng" typeface="Ebrima"/>
       </a:majorFont>
       <a:minorFont>
-        <a:latin typeface="Cambria"/>
+        <a:latin typeface="Aptos" panose="02110004020202020204"/>
         <a:ea typeface=""/>
         <a:cs typeface=""/>
-        <a:font script="Jpan" typeface="ＭＳ 明朝"/>
+        <a:font script="Jpan" typeface="游明朝"/>
         <a:font script="Hang" typeface="맑은 고딕"/>
-        <a:font script="Hans" typeface="宋体"/>
+        <a:font script="Hans" typeface="等线"/>
         <a:font script="Hant" typeface="新細明體"/>
         <a:font script="Arab" typeface="Arial"/>
         <a:font script="Hebr" typeface="Arial"/>
@@ -3076,6 +3938,24 @@
         <a:font script="Mong" typeface="Mongolian Baiti"/>
         <a:font script="Viet" typeface="Arial"/>
         <a:font script="Uigh" typeface="Microsoft Uighur"/>
+        <a:font script="Geor" typeface="Sylfaen"/>
+        <a:font script="Armn" typeface="Arial"/>
+        <a:font script="Bugi" typeface="Leelawadee UI"/>
+        <a:font script="Bopo" typeface="Microsoft JhengHei"/>
+        <a:font script="Java" typeface="Javanese Text"/>
+        <a:font script="Lisu" typeface="Segoe UI"/>
+        <a:font script="Mymr" typeface="Myanmar Text"/>
+        <a:font script="Nkoo" typeface="Ebrima"/>
+        <a:font script="Olck" typeface="Nirmala UI"/>
+        <a:font script="Osma" typeface="Ebrima"/>
+        <a:font script="Phag" typeface="Phagspa"/>
+        <a:font script="Syrn" typeface="Estrangelo Edessa"/>
+        <a:font script="Syrj" typeface="Estrangelo Edessa"/>
+        <a:font script="Syre" typeface="Estrangelo Edessa"/>
+        <a:font script="Sora" typeface="Nirmala UI"/>
+        <a:font script="Tale" typeface="Microsoft Tai Le"/>
+        <a:font script="Talu" typeface="Microsoft New Tai Lue"/>
+        <a:font script="Tfng" typeface="Ebrima"/>
       </a:minorFont>
     </a:fontScheme>
     <a:fmtScheme name="Office">
@@ -3087,200 +3967,141 @@
           <a:gsLst>
             <a:gs pos="0">
               <a:schemeClr val="phClr">
-                <a:tint val="50000"/>
-                <a:satMod val="300000"/>
+                <a:lumMod val="110000"/>
+                <a:satMod val="105000"/>
+                <a:tint val="67000"/>
               </a:schemeClr>
             </a:gs>
-            <a:gs pos="35000">
+            <a:gs pos="50000">
               <a:schemeClr val="phClr">
-                <a:tint val="37000"/>
-                <a:satMod val="300000"/>
+                <a:lumMod val="105000"/>
+                <a:satMod val="103000"/>
+                <a:tint val="73000"/>
               </a:schemeClr>
             </a:gs>
             <a:gs pos="100000">
               <a:schemeClr val="phClr">
-                <a:tint val="15000"/>
-                <a:satMod val="350000"/>
+                <a:lumMod val="105000"/>
+                <a:satMod val="109000"/>
+                <a:tint val="81000"/>
               </a:schemeClr>
             </a:gs>
           </a:gsLst>
-          <a:lin ang="16200000" scaled="1"/>
+          <a:lin ang="5400000" scaled="0"/>
         </a:gradFill>
         <a:gradFill rotWithShape="1">
           <a:gsLst>
             <a:gs pos="0">
               <a:schemeClr val="phClr">
-                <a:tint val="100000"/>
+                <a:satMod val="103000"/>
+                <a:lumMod val="102000"/>
+                <a:tint val="94000"/>
+              </a:schemeClr>
+            </a:gs>
+            <a:gs pos="50000">
+              <a:schemeClr val="phClr">
+                <a:satMod val="110000"/>
+                <a:lumMod val="100000"/>
                 <a:shade val="100000"/>
-                <a:satMod val="130000"/>
               </a:schemeClr>
             </a:gs>
             <a:gs pos="100000">
               <a:schemeClr val="phClr">
-                <a:tint val="50000"/>
-                <a:shade val="100000"/>
-                <a:satMod val="350000"/>
+                <a:lumMod val="99000"/>
+                <a:satMod val="120000"/>
+                <a:shade val="78000"/>
               </a:schemeClr>
             </a:gs>
           </a:gsLst>
-          <a:lin ang="16200000" scaled="0"/>
+          <a:lin ang="5400000" scaled="0"/>
         </a:gradFill>
       </a:fillStyleLst>
       <a:lnStyleLst>
-        <a:ln w="9525" cap="flat" cmpd="sng" algn="ctr">
-          <a:solidFill>
-            <a:schemeClr val="phClr">
-              <a:shade val="95000"/>
-              <a:satMod val="105000"/>
-            </a:schemeClr>
-          </a:solidFill>
-          <a:prstDash val="solid"/>
-        </a:ln>
-        <a:ln w="25400" cap="flat" cmpd="sng" algn="ctr">
+        <a:ln w="6350" cap="flat" cmpd="sng" algn="ctr">
           <a:solidFill>
             <a:schemeClr val="phClr"/>
           </a:solidFill>
           <a:prstDash val="solid"/>
+          <a:miter lim="800000"/>
         </a:ln>
-        <a:ln w="38100" cap="flat" cmpd="sng" algn="ctr">
+        <a:ln w="12700" cap="flat" cmpd="sng" algn="ctr">
           <a:solidFill>
             <a:schemeClr val="phClr"/>
           </a:solidFill>
           <a:prstDash val="solid"/>
+          <a:miter lim="800000"/>
+        </a:ln>
+        <a:ln w="19050" cap="flat" cmpd="sng" algn="ctr">
+          <a:solidFill>
+            <a:schemeClr val="phClr"/>
+          </a:solidFill>
+          <a:prstDash val="solid"/>
+          <a:miter lim="800000"/>
         </a:ln>
       </a:lnStyleLst>
       <a:effectStyleLst>
         <a:effectStyle>
+          <a:effectLst/>
+        </a:effectStyle>
+        <a:effectStyle>
+          <a:effectLst/>
+        </a:effectStyle>
+        <a:effectStyle>
           <a:effectLst>
-            <a:outerShdw blurRad="40000" dist="20000" dir="5400000" rotWithShape="0">
+            <a:outerShdw blurRad="57150" dist="19050" dir="5400000" algn="ctr" rotWithShape="0">
               <a:srgbClr val="000000">
-                <a:alpha val="38000"/>
+                <a:alpha val="63000"/>
               </a:srgbClr>
             </a:outerShdw>
           </a:effectLst>
-        </a:effectStyle>
-        <a:effectStyle>
-          <a:effectLst>
-            <a:outerShdw blurRad="40000" dist="23000" dir="5400000" rotWithShape="0">
-              <a:srgbClr val="000000">
-                <a:alpha val="35000"/>
-              </a:srgbClr>
-            </a:outerShdw>
-          </a:effectLst>
-        </a:effectStyle>
-        <a:effectStyle>
-          <a:effectLst>
-            <a:outerShdw blurRad="40000" dist="23000" dir="5400000" rotWithShape="0">
-              <a:srgbClr val="000000">
-                <a:alpha val="35000"/>
-              </a:srgbClr>
-            </a:outerShdw>
-          </a:effectLst>
-          <a:scene3d>
-            <a:camera prst="orthographicFront">
-              <a:rot lat="0" lon="0" rev="0"/>
-            </a:camera>
-            <a:lightRig rig="threePt" dir="t">
-              <a:rot lat="0" lon="0" rev="1200000"/>
-            </a:lightRig>
-          </a:scene3d>
-          <a:sp3d>
-            <a:bevelT w="63500" h="25400"/>
-          </a:sp3d>
         </a:effectStyle>
       </a:effectStyleLst>
       <a:bgFillStyleLst>
         <a:solidFill>
           <a:schemeClr val="phClr"/>
         </a:solidFill>
+        <a:solidFill>
+          <a:schemeClr val="phClr">
+            <a:tint val="95000"/>
+            <a:satMod val="170000"/>
+          </a:schemeClr>
+        </a:solidFill>
         <a:gradFill rotWithShape="1">
           <a:gsLst>
             <a:gs pos="0">
               <a:schemeClr val="phClr">
-                <a:tint val="40000"/>
-                <a:satMod val="350000"/>
+                <a:tint val="93000"/>
+                <a:satMod val="150000"/>
+                <a:shade val="98000"/>
+                <a:lumMod val="102000"/>
               </a:schemeClr>
             </a:gs>
-            <a:gs pos="40000">
+            <a:gs pos="50000">
               <a:schemeClr val="phClr">
-                <a:tint val="45000"/>
-                <a:shade val="99000"/>
-                <a:satMod val="350000"/>
+                <a:tint val="98000"/>
+                <a:satMod val="130000"/>
+                <a:shade val="90000"/>
+                <a:lumMod val="103000"/>
               </a:schemeClr>
             </a:gs>
             <a:gs pos="100000">
               <a:schemeClr val="phClr">
-                <a:shade val="20000"/>
-                <a:satMod val="255000"/>
+                <a:shade val="63000"/>
+                <a:satMod val="120000"/>
               </a:schemeClr>
             </a:gs>
           </a:gsLst>
-          <a:path path="circle">
-            <a:fillToRect l="50000" t="-80000" r="50000" b="180000"/>
-          </a:path>
-        </a:gradFill>
-        <a:gradFill rotWithShape="1">
-          <a:gsLst>
-            <a:gs pos="0">
-              <a:schemeClr val="phClr">
-                <a:tint val="80000"/>
-                <a:satMod val="300000"/>
-              </a:schemeClr>
-            </a:gs>
-            <a:gs pos="100000">
-              <a:schemeClr val="phClr">
-                <a:shade val="30000"/>
-                <a:satMod val="200000"/>
-              </a:schemeClr>
-            </a:gs>
-          </a:gsLst>
-          <a:path path="circle">
-            <a:fillToRect l="50000" t="50000" r="50000" b="50000"/>
-          </a:path>
+          <a:lin ang="5400000" scaled="0"/>
         </a:gradFill>
       </a:bgFillStyleLst>
     </a:fmtScheme>
   </a:themeElements>
-  <a:objectDefaults>
-    <a:spDef>
-      <a:spPr/>
-      <a:bodyPr/>
-      <a:lstStyle/>
-      <a:style>
-        <a:lnRef idx="1">
-          <a:schemeClr val="accent1"/>
-        </a:lnRef>
-        <a:fillRef idx="3">
-          <a:schemeClr val="accent1"/>
-        </a:fillRef>
-        <a:effectRef idx="2">
-          <a:schemeClr val="accent1"/>
-        </a:effectRef>
-        <a:fontRef idx="minor">
-          <a:schemeClr val="lt1"/>
-        </a:fontRef>
-      </a:style>
-    </a:spDef>
-    <a:lnDef>
-      <a:spPr/>
-      <a:bodyPr/>
-      <a:lstStyle/>
-      <a:style>
-        <a:lnRef idx="2">
-          <a:schemeClr val="accent1"/>
-        </a:lnRef>
-        <a:fillRef idx="0">
-          <a:schemeClr val="accent1"/>
-        </a:fillRef>
-        <a:effectRef idx="1">
-          <a:schemeClr val="accent1"/>
-        </a:effectRef>
-        <a:fontRef idx="minor">
-          <a:schemeClr val="tx1"/>
-        </a:fontRef>
-      </a:style>
-    </a:lnDef>
-  </a:objectDefaults>
+  <a:objectDefaults/>
   <a:extraClrSchemeLst/>
+  <a:extLst>
+    <a:ext uri="{05A4C25C-085E-4340-85A3-A5531E510DB2}">
+      <thm15:themeFamily xmlns:thm15="http://schemas.microsoft.com/office/thememl/2012/main" name="Office Theme" id="{2E142A2C-CD16-42D6-873A-C26D2A0506FA}" vid="{1BDDFF52-6CD6-40A5-AB3C-68EB2F1E4D0A}"/>
+    </a:ext>
+  </a:extLst>
 </a:theme>
 </file>
</xml_diff>